<commit_message>
borrador tfm sesion 1
- Correcciones ortográficas en TFM_Garza_main.docx (erratas aprobadas)
- Tablas insertadas: variables de segmentación + stack tecnológico
- Sección 0 (organización grupal) desarrollada en E1_borrador.md
- Archivo auxiliar con tablas formateadas para copy-paste

Co-Authored-By: Claude Opus 4.6 (1M context) <noreply@anthropic.com>
</commit_message>
<xml_diff>
--- a/Cuatrimestre_2/TFM_Promociones_B2B/entregas/TFM_Garza_main.docx
+++ b/Cuatrimestre_2/TFM_Promociones_B2B/entregas/TFM_Garza_main.docx
@@ -23,7 +23,7 @@
           <w:lang w:eastAsia="es-ES"/>
         </w:rPr>
         <w:drawing>
-          <wp:inline distT="0" distB="0" distL="0" distR="0" wp14:anchorId="402EFF8F" wp14:editId="1CEC1C1A">
+          <wp:inline distT="0" distB="0" distL="0" distR="0" wp14:anchorId="402EFF8F" wp14:editId="2B85ED31">
             <wp:extent cx="3815723" cy="1038225"/>
             <wp:effectExtent l="0" t="0" r="0" b="0"/>
             <wp:docPr id="5126" name="Picture 1"/>
@@ -6477,101 +6477,47 @@
     </w:p>
     <w:p>
       <w:r>
-        <w:t xml:space="preserve">En la distribución </w:t>
+        <w:t xml:space="preserve">En la distribución comercial a través de las superficies de bienes de consumo (Fast Moving Consumer Goods – FMCG) los canales de venta están cada vez más atomizados. Las superficies son físicas y digitales, especializadas en diferentes categorías de producto de un grupo de marcas (Por ejemplo: alimentación ecológica o boutiques de tecnología) para diferentes públicos objetivo (Gen Z, aventureros, familias con mascota, etc.). La amalgama de canales como supermercados, hipermercados, ferreterías, centros bricolajeros, bazares, tiendas de electrodomésticos y tecnología, y un largo etc.  sitúa a España como un país con una gran capilaridad comercial, lo que supone un reto competitivo para las marcas. </w:t>
       </w:r>
       <w:proofErr w:type="spellStart"/>
-      <w:r>
-        <w:t>commercial</w:t>
-      </w:r>
+      <w:r/>
       <w:proofErr w:type="spellEnd"/>
-      <w:r>
-        <w:t xml:space="preserve"> </w:t>
-      </w:r>
-      <w:r>
-        <w:t>a través de</w:t>
-      </w:r>
-      <w:r>
-        <w:t xml:space="preserve"> las</w:t>
-      </w:r>
-      <w:r>
-        <w:t xml:space="preserve"> </w:t>
-      </w:r>
+      <w:r/>
+      <w:r/>
+      <w:r/>
+      <w:r/>
       <w:proofErr w:type="spellStart"/>
-      <w:r>
-        <w:t>superfices</w:t>
-      </w:r>
+      <w:r/>
       <w:proofErr w:type="spellEnd"/>
-      <w:r>
-        <w:t xml:space="preserve"> de bienes de consumo (</w:t>
-      </w:r>
+      <w:r/>
       <w:proofErr w:type="spellStart"/>
-      <w:r>
-        <w:t>Fast</w:t>
-      </w:r>
+      <w:r/>
       <w:proofErr w:type="spellEnd"/>
-      <w:r>
-        <w:t xml:space="preserve"> </w:t>
-      </w:r>
+      <w:r/>
       <w:proofErr w:type="spellStart"/>
-      <w:r>
-        <w:t>Moving</w:t>
-      </w:r>
+      <w:r/>
       <w:proofErr w:type="spellEnd"/>
-      <w:r>
-        <w:t xml:space="preserve"> </w:t>
-      </w:r>
+      <w:r/>
       <w:proofErr w:type="spellStart"/>
-      <w:r>
-        <w:t>Consumer</w:t>
-      </w:r>
+      <w:r/>
       <w:proofErr w:type="spellEnd"/>
-      <w:r>
-        <w:t xml:space="preserve"> </w:t>
-      </w:r>
+      <w:r/>
       <w:proofErr w:type="spellStart"/>
-      <w:r>
-        <w:t>Goods</w:t>
-      </w:r>
+      <w:r/>
       <w:proofErr w:type="spellEnd"/>
-      <w:r>
-        <w:t xml:space="preserve"> – FMCG) los canales de venta están cada vez más atomizados. Las superficies son físicas y digitales, especializa</w:t>
-      </w:r>
-      <w:r>
-        <w:t>das</w:t>
-      </w:r>
-      <w:r>
-        <w:t xml:space="preserve"> en diferentes categorías de producto</w:t>
-      </w:r>
-      <w:r>
-        <w:t xml:space="preserve"> de un grupo de marcas</w:t>
-      </w:r>
-      <w:r>
-        <w:t xml:space="preserve"> (Por ejemplo: alimentación ecológica o boutiques de tecnología) para diferentes públicos objetivo (Gen Z, aventureros, familias con mascota, etc.).</w:t>
-      </w:r>
-      <w:r>
-        <w:t xml:space="preserve"> La </w:t>
-      </w:r>
-      <w:r>
-        <w:t>amalgama de canales</w:t>
-      </w:r>
-      <w:r>
-        <w:t xml:space="preserve"> como</w:t>
-      </w:r>
-      <w:r>
-        <w:t xml:space="preserve"> supermercados, hipermercados, </w:t>
-      </w:r>
-      <w:r>
-        <w:t xml:space="preserve">ferreterías, centros bricolajeros, bazares, tiendas de electrodomésticos y tecnología, y un largo etc.  </w:t>
-      </w:r>
-      <w:r>
-        <w:t xml:space="preserve">sitúa a </w:t>
-      </w:r>
-      <w:r>
-        <w:t xml:space="preserve">España </w:t>
-      </w:r>
-      <w:r>
-        <w:t xml:space="preserve">como un país con una gran capilaridad comercial, lo que supone un reto competitivo para las marcas. </w:t>
-      </w:r>
+      <w:r/>
+      <w:r/>
+      <w:r/>
+      <w:r/>
+      <w:r/>
+      <w:r/>
+      <w:r/>
+      <w:r/>
+      <w:r/>
+      <w:r/>
+      <w:r/>
+      <w:r/>
+      <w:r/>
     </w:p>
     <w:p>
       <w:r>
@@ -6638,14 +6584,12 @@
       <w:pPr>
         <w:pStyle w:val="Heading2"/>
       </w:pPr>
-      <w:bookmarkStart w:id="9" w:name="_Toc32304471"/>
       <w:r>
         <w:rPr>
           <w:caps w:val="0"/>
         </w:rPr>
-        <w:t>Objetivos del TFE</w:t>
-      </w:r>
-      <w:bookmarkEnd w:id="9"/>
+        <w:t>Planteamiento del problema</w:t>
+      </w:r>
     </w:p>
     <w:p>
       <w:pPr>
@@ -6658,17 +6602,343 @@
       </w:pPr>
     </w:p>
     <w:p>
-      <w:r>
-        <w:t>Texto Normal del menú de estilos.</w:t>
-      </w:r>
-    </w:p>
+      <w:proofErr w:type="spellStart"/>
+      <w:r>
+        <w:t>Imprex</w:t>
+      </w:r>
+      <w:proofErr w:type="spellEnd"/>
+      <w:r>
+        <w:t xml:space="preserve"> </w:t>
+      </w:r>
+      <w:proofErr w:type="spellStart"/>
+      <w:r>
+        <w:t>Europe</w:t>
+      </w:r>
+      <w:proofErr w:type="spellEnd"/>
+      <w:r>
+        <w:t xml:space="preserve"> diseña promociones a los canales por el estándar SAP conocido como ‘RAMO’ (es decir, tipo de canal) utilizando descuentos uniformes con condiciones. Por ejemplo: ‘Para el </w:t>
+      </w:r>
+      <w:proofErr w:type="gramStart"/>
+      <w:r>
+        <w:t xml:space="preserve">ramo </w:t>
+      </w:r>
+      <w:r>
+        <w:t xml:space="preserve"> X</w:t>
+      </w:r>
+      <w:proofErr w:type="gramEnd"/>
+      <w:r>
+        <w:t xml:space="preserve"> Por la compra de 500€ en Y referencias, aplica un descuento del 7%’. No existe una </w:t>
+      </w:r>
+      <w:proofErr w:type="spellStart"/>
+      <w:r>
+        <w:t>segmentación</w:t>
+      </w:r>
+      <w:proofErr w:type="spellEnd"/>
+      <w:r>
+        <w:t xml:space="preserve"> por </w:t>
+      </w:r>
+      <w:proofErr w:type="spellStart"/>
+      <w:r>
+        <w:t>comportamiento</w:t>
+      </w:r>
+      <w:proofErr w:type="spellEnd"/>
+      <w:r>
+        <w:t xml:space="preserve"> de compra ni una evaluación previa de escenarios de </w:t>
+      </w:r>
+      <w:r>
+        <w:lastRenderedPageBreak/>
+        <w:t xml:space="preserve">rentabilidad (Break </w:t>
+      </w:r>
+      <w:proofErr w:type="spellStart"/>
+      <w:r>
+        <w:t>Even</w:t>
+      </w:r>
+      <w:proofErr w:type="spellEnd"/>
+      <w:r>
+        <w:t xml:space="preserve"> Point). Las decisiones son tipo HIPPO, o basados en la experiencia intuitiva. Esto genera una dilución de margen en clientes que habría comprado igual -con o sin descuento-, y </w:t>
+      </w:r>
+      <w:proofErr w:type="spellStart"/>
+      <w:r>
+        <w:t>oportunidades</w:t>
+      </w:r>
+      <w:proofErr w:type="spellEnd"/>
+      <w:r>
+        <w:t xml:space="preserve"> perdidas con clientes que necesitan incentivos distintos. </w:t>
+      </w:r>
+    </w:p>
+    <w:p>
+      <w:r>
+        <w:t xml:space="preserve">Nuestro caso de estudio concreto se </w:t>
+      </w:r>
+      <w:r>
+        <w:t>basa</w:t>
+      </w:r>
+      <w:r>
+        <w:t xml:space="preserve"> en una de las marcas que tiene </w:t>
+      </w:r>
+      <w:proofErr w:type="spellStart"/>
+      <w:r>
+        <w:t>Imprex</w:t>
+      </w:r>
+      <w:proofErr w:type="spellEnd"/>
+      <w:r>
+        <w:t xml:space="preserve"> en distribución. Garza, marca líder en iluminación y conectividad </w:t>
+      </w:r>
+      <w:proofErr w:type="spellStart"/>
+      <w:r>
+        <w:t>IoT</w:t>
+      </w:r>
+      <w:proofErr w:type="spellEnd"/>
+      <w:r>
+        <w:t xml:space="preserve"> </w:t>
+      </w:r>
+      <w:r>
+        <w:t xml:space="preserve">distribuida a través de múltiples canales B2B. </w:t>
+      </w:r>
+    </w:p>
+    <w:p>
+      <w:r>
+        <w:t xml:space="preserve">Nuestra pregunta de investigación es ¿Es posible optimizar las promociones comerciales B2B mediante segmentación analítica de clientes y simulación de escenarios de rentabilidad? </w:t>
+      </w:r>
+    </w:p>
+    <w:p/>
+    <w:p/>
+    <w:p/>
+    <w:p/>
+    <w:p>
+      <w:pPr>
+        <w:pStyle w:val="Heading2"/>
+        <w:rPr>
+          <w:caps w:val="0"/>
+        </w:rPr>
+      </w:pPr>
+      <w:r>
+        <w:rPr>
+          <w:caps w:val="0"/>
+        </w:rPr>
+        <w:t>Objetivos del TFM:</w:t>
+      </w:r>
+    </w:p>
+    <w:p>
+      <w:r>
+        <w:t xml:space="preserve">Diseñamos un sistema de segmentación de clientes B2B y de optimización de promociones comerciales para la marca Garza, utilizando técnicas de </w:t>
+      </w:r>
+      <w:proofErr w:type="spellStart"/>
+      <w:r>
+        <w:t>clustering</w:t>
+      </w:r>
+      <w:proofErr w:type="spellEnd"/>
+      <w:r>
+        <w:t xml:space="preserve"> (K-</w:t>
+      </w:r>
+      <w:proofErr w:type="spellStart"/>
+      <w:r>
+        <w:t>means</w:t>
+      </w:r>
+      <w:proofErr w:type="spellEnd"/>
+      <w:r>
+        <w:t xml:space="preserve">) y análisis de rentabilidad, utilizando los datos reales del ERP (SAP) de su distribuidora </w:t>
+      </w:r>
+      <w:proofErr w:type="spellStart"/>
+      <w:r>
+        <w:t>Imprex</w:t>
+      </w:r>
+      <w:proofErr w:type="spellEnd"/>
+      <w:r>
+        <w:t xml:space="preserve"> </w:t>
+      </w:r>
+      <w:proofErr w:type="spellStart"/>
+      <w:r>
+        <w:t>Europe</w:t>
+      </w:r>
+      <w:proofErr w:type="spellEnd"/>
+      <w:r>
+        <w:t xml:space="preserve"> S.L. </w:t>
+      </w:r>
+    </w:p>
+    <w:p>
+      <w:r>
+        <w:t xml:space="preserve">Este sistema aspira no solamente a ser una propuesta académica, sino que también propondremos un sistema modular y reproducible que pueda ser implementado, mantenido y escalado. </w:t>
+      </w:r>
+    </w:p>
+    <w:p>
+      <w:r>
+        <w:t xml:space="preserve">Nuestros objetivos específicos son: </w:t>
+      </w:r>
+    </w:p>
+    <w:p>
+      <w:pPr>
+        <w:pStyle w:val="ListParagraph"/>
+        <w:numPr>
+          <w:ilvl w:val="0"/>
+          <w:numId w:val="24"/>
+        </w:numPr>
+      </w:pPr>
+      <w:r>
+        <w:t>Definir el alcance de datos necesarios (clientes, categorías de producto y canales de venta) y realizar el proceso ETL para obtener los datos del data lake corporativo en crudo, su exploración, limpieza e identificación de patrones</w:t>
+      </w:r>
+      <w:r/>
+      <w:r/>
+      <w:r/>
+      <w:r/>
+      <w:r/>
+      <w:proofErr w:type="spellStart"/>
+      <w:r/>
+      <w:proofErr w:type="spellEnd"/>
+      <w:r/>
+    </w:p>
+    <w:p>
+      <w:pPr>
+        <w:pStyle w:val="ListParagraph"/>
+        <w:numPr>
+          <w:ilvl w:val="0"/>
+          <w:numId w:val="24"/>
+        </w:numPr>
+      </w:pPr>
+      <w:r>
+        <w:t xml:space="preserve">Segmentar la base de clientes B2B mediante un </w:t>
+      </w:r>
+      <w:proofErr w:type="spellStart"/>
+      <w:r>
+        <w:t>clustering</w:t>
+      </w:r>
+      <w:proofErr w:type="spellEnd"/>
+      <w:r>
+        <w:t xml:space="preserve"> K-</w:t>
+      </w:r>
+      <w:proofErr w:type="spellStart"/>
+      <w:r>
+        <w:t>means</w:t>
+      </w:r>
+      <w:proofErr w:type="spellEnd"/>
+      <w:r>
+        <w:t xml:space="preserve"> sobre las variables de comportamiento relacionadas con la compra (volumen, frecuencia, categorías, </w:t>
+      </w:r>
+      <w:proofErr w:type="gramStart"/>
+      <w:r>
+        <w:t>ticket</w:t>
+      </w:r>
+      <w:proofErr w:type="gramEnd"/>
+      <w:r>
+        <w:t xml:space="preserve"> medio, tendencia, margen y otras dimensiones de cliente). </w:t>
+      </w:r>
+    </w:p>
+    <w:p>
+      <w:pPr>
+        <w:pStyle w:val="ListParagraph"/>
+        <w:numPr>
+          <w:ilvl w:val="0"/>
+          <w:numId w:val="24"/>
+        </w:numPr>
+      </w:pPr>
+      <w:r>
+        <w:t>Perfilar los segmentos resultantes mediante árboles de decisión para generar reglas que la dirección pueda interpretar, especialmente los equipos de marketing y comercial</w:t>
+      </w:r>
+    </w:p>
+    <w:p>
+      <w:pPr>
+        <w:pStyle w:val="ListParagraph"/>
+        <w:numPr>
+          <w:ilvl w:val="0"/>
+          <w:numId w:val="24"/>
+        </w:numPr>
+      </w:pPr>
+      <w:r>
+        <w:t xml:space="preserve">Simular escenarios promocionales por segmento mediante el cálculo del ‘Break </w:t>
+      </w:r>
+      <w:proofErr w:type="spellStart"/>
+      <w:r>
+        <w:t>Even</w:t>
+      </w:r>
+      <w:proofErr w:type="spellEnd"/>
+      <w:r>
+        <w:t xml:space="preserve"> Point’ (BEP) y matrices de respuesta (r * g)</w:t>
+      </w:r>
+    </w:p>
+    <w:p>
+      <w:pPr>
+        <w:pStyle w:val="ListParagraph"/>
+        <w:numPr>
+          <w:ilvl w:val="0"/>
+          <w:numId w:val="24"/>
+        </w:numPr>
+      </w:pPr>
+      <w:r>
+        <w:t xml:space="preserve">Implementar un sistema de </w:t>
+      </w:r>
+      <w:proofErr w:type="gramStart"/>
+      <w:r>
+        <w:t xml:space="preserve">Business </w:t>
+      </w:r>
+      <w:proofErr w:type="spellStart"/>
+      <w:r>
+        <w:t>Intelligence</w:t>
+      </w:r>
+      <w:proofErr w:type="spellEnd"/>
+      <w:proofErr w:type="gramEnd"/>
+      <w:r>
+        <w:t xml:space="preserve"> visual que integre la segmentación y los escenarios para la toma de decisiones. </w:t>
+      </w:r>
+    </w:p>
+    <w:p>
+      <w:r>
+        <w:t>En definitiva, este sistema sirve para la toma de decisiones basados en el estudio descriptivo avanzado de los clientes para ofrecer una solución prescriptiva de las mejores estrategias comerciales en base a datos empíricos.</w:t>
+      </w:r>
+    </w:p>
+    <w:p/>
+    <w:p>
+      <w:pPr>
+        <w:pStyle w:val="Heading1"/>
+        <w:rPr>
+          <w:caps w:val="0"/>
+        </w:rPr>
+      </w:pPr>
+      <w:r>
+        <w:rPr>
+          <w:caps w:val="0"/>
+        </w:rPr>
+        <w:t>Datos y metodología</w:t>
+      </w:r>
+    </w:p>
+    <w:p>
+      <w:pPr>
+        <w:pStyle w:val="Heading2"/>
+      </w:pPr>
+      <w:r>
+        <w:rPr>
+          <w:caps w:val="0"/>
+        </w:rPr>
+        <w:t>Fuentes de datos</w:t>
+      </w:r>
+    </w:p>
+    <w:p/>
+    <w:p>
+      <w:r>
+        <w:t xml:space="preserve">Los datos proceden del ERP SAP de </w:t>
+      </w:r>
+      <w:proofErr w:type="spellStart"/>
+      <w:r>
+        <w:t>Imprex</w:t>
+      </w:r>
+      <w:proofErr w:type="spellEnd"/>
+      <w:r>
+        <w:t xml:space="preserve"> </w:t>
+      </w:r>
+      <w:proofErr w:type="spellStart"/>
+      <w:r>
+        <w:t>Europe</w:t>
+      </w:r>
+      <w:proofErr w:type="spellEnd"/>
+      <w:r>
+        <w:t xml:space="preserve">. Son datos transaccionales replicados en una base de datos Oracle (esquema REPORTING). Se trabaja con datos transaccionales reales de la marca Garza, todas sus categorías de producto, para un periodo de 12-24 meses. </w:t>
+      </w:r>
+    </w:p>
+    <w:p/>
     <w:p>
       <w:pPr>
         <w:rPr>
           <w:b/>
           <w:bCs/>
-          <w:i/>
-          <w:iCs/>
         </w:rPr>
       </w:pPr>
       <w:r>
@@ -6676,1262 +6946,981 @@
           <w:b/>
           <w:bCs/>
         </w:rPr>
-        <w:t xml:space="preserve">Figura 1. </w:t>
-      </w:r>
-      <w:r>
-        <w:rPr>
-          <w:i/>
-          <w:iCs/>
-        </w:rPr>
-        <w:t>Ejemplo de figura realizada para nuestro trabajo.</w:t>
-      </w:r>
-    </w:p>
-    <w:p/>
-    <w:p>
-      <w:pPr>
+        <w:t>Datos necesarios</w:t>
+      </w:r>
+      <w:r>
+        <w:rPr>
+          <w:b/>
+          <w:bCs/>
+        </w:rPr>
+        <w:t xml:space="preserve"> en estándar SAP: </w:t>
+      </w:r>
+    </w:p>
+    <w:p>
+      <w:pPr>
+        <w:pStyle w:val="ListParagraph"/>
+        <w:numPr>
+          <w:ilvl w:val="0"/>
+          <w:numId w:val="24"/>
+        </w:numPr>
+        <w:rPr>
+          <w:b/>
+          <w:bCs/>
+        </w:rPr>
+      </w:pPr>
+      <w:r>
+        <w:rPr>
+          <w:b/>
+          <w:bCs/>
+        </w:rPr>
+        <w:t xml:space="preserve">Maestros de clientes: </w:t>
+      </w:r>
+      <w:r>
+        <w:t>Código, nombre, Ramo (canal), zona, comercial asignado.</w:t>
+      </w:r>
+    </w:p>
+    <w:p>
+      <w:pPr>
+        <w:pStyle w:val="ListParagraph"/>
+        <w:numPr>
+          <w:ilvl w:val="0"/>
+          <w:numId w:val="24"/>
+        </w:numPr>
+      </w:pPr>
+      <w:r>
+        <w:rPr>
+          <w:b/>
+          <w:bCs/>
+        </w:rPr>
+        <w:t>Transacciones</w:t>
+      </w:r>
+      <w:r>
+        <w:t xml:space="preserve">: fecha, cliente, artículo, cantidad, precio neto, descuento aplicado, margen </w:t>
+      </w:r>
+    </w:p>
+    <w:p>
+      <w:pPr>
+        <w:pStyle w:val="ListParagraph"/>
+        <w:numPr>
+          <w:ilvl w:val="0"/>
+          <w:numId w:val="24"/>
+        </w:numPr>
+      </w:pPr>
+      <w:r>
+        <w:rPr>
+          <w:b/>
+          <w:bCs/>
+        </w:rPr>
+        <w:t xml:space="preserve">Maestro de artículos: </w:t>
+      </w:r>
+      <w:r>
+        <w:t>código, descripción, familia/categoría</w:t>
+      </w:r>
+    </w:p>
+    <w:p>
+      <w:pPr>
+        <w:pStyle w:val="ListParagraph"/>
+        <w:numPr>
+          <w:ilvl w:val="0"/>
+          <w:numId w:val="24"/>
+        </w:numPr>
+      </w:pPr>
+      <w:r>
+        <w:rPr>
+          <w:b/>
+          <w:bCs/>
+        </w:rPr>
+        <w:t>Condiciones comerciales:</w:t>
+      </w:r>
+      <w:r>
+        <w:t xml:space="preserve"> </w:t>
+      </w:r>
+      <w:proofErr w:type="gramStart"/>
+      <w:r>
+        <w:t>descuento vigentes</w:t>
+      </w:r>
+      <w:proofErr w:type="gramEnd"/>
+      <w:r>
+        <w:t xml:space="preserve"> por cliente/canal</w:t>
+      </w:r>
+    </w:p>
+    <w:p>
+      <w:r>
+        <w:rPr>
+          <w:b/>
+        </w:rPr>
+        <w:t>Variables de segmentación a construir:</w:t>
+      </w:r>
+    </w:p>
+    <w:tbl>
+      <w:tblPr>
+        <w:tblW w:type="auto" w:w="0"/>
         <w:jc w:val="center"/>
-      </w:pPr>
-      <w:r>
-        <w:rPr>
-          <w:noProof/>
+        <w:tblLook w:firstColumn="1" w:firstRow="1" w:lastColumn="0" w:lastRow="0" w:noHBand="0" w:noVBand="1" w:val="04A0"/>
+      </w:tblPr>
+      <w:tblGrid>
+        <w:gridCol w:w="3024"/>
+        <w:gridCol w:w="3024"/>
+        <w:gridCol w:w="3024"/>
+      </w:tblGrid>
+      <w:tr>
+        <w:tc>
+          <w:tcPr>
+            <w:tcW w:type="dxa" w:w="3024"/>
+          </w:tcPr>
+          <w:p>
+            <w:r>
+              <w:rPr>
+                <w:b/>
+              </w:rPr>
+              <w:t>Variable</w:t>
+            </w:r>
+          </w:p>
+        </w:tc>
+        <w:tc>
+          <w:tcPr>
+            <w:tcW w:type="dxa" w:w="3024"/>
+          </w:tcPr>
+          <w:p>
+            <w:r>
+              <w:rPr>
+                <w:b/>
+              </w:rPr>
+              <w:t>Cálculo</w:t>
+            </w:r>
+          </w:p>
+        </w:tc>
+        <w:tc>
+          <w:tcPr>
+            <w:tcW w:type="dxa" w:w="3024"/>
+          </w:tcPr>
+          <w:p>
+            <w:r>
+              <w:rPr>
+                <w:b/>
+              </w:rPr>
+              <w:t>Fuente</w:t>
+            </w:r>
+          </w:p>
+        </w:tc>
+      </w:tr>
+      <w:tr>
+        <w:tc>
+          <w:tcPr>
+            <w:tcW w:type="dxa" w:w="3024"/>
+          </w:tcPr>
+          <w:p>
+            <w:r>
+              <w:t>Volumen anual (€)</w:t>
+            </w:r>
+          </w:p>
+        </w:tc>
+        <w:tc>
+          <w:tcPr>
+            <w:tcW w:type="dxa" w:w="3024"/>
+          </w:tcPr>
+          <w:p>
+            <w:r>
+              <w:t>SUM(neto) por cliente</w:t>
+            </w:r>
+          </w:p>
+        </w:tc>
+        <w:tc>
+          <w:tcPr>
+            <w:tcW w:type="dxa" w:w="3024"/>
+          </w:tcPr>
+          <w:p>
+            <w:r>
+              <w:t>Facturación</w:t>
+            </w:r>
+          </w:p>
+        </w:tc>
+      </w:tr>
+      <w:tr>
+        <w:tc>
+          <w:tcPr>
+            <w:tcW w:type="dxa" w:w="3024"/>
+          </w:tcPr>
+          <w:p>
+            <w:r>
+              <w:t>Frecuencia de pedido</w:t>
+            </w:r>
+          </w:p>
+        </w:tc>
+        <w:tc>
+          <w:tcPr>
+            <w:tcW w:type="dxa" w:w="3024"/>
+          </w:tcPr>
+          <w:p>
+            <w:r>
+              <w:t>COUNT(DISTINCT pedido) por cliente</w:t>
+            </w:r>
+          </w:p>
+        </w:tc>
+        <w:tc>
+          <w:tcPr>
+            <w:tcW w:type="dxa" w:w="3024"/>
+          </w:tcPr>
+          <w:p>
+            <w:r>
+              <w:t>Pedidos</w:t>
+            </w:r>
+          </w:p>
+        </w:tc>
+      </w:tr>
+      <w:tr>
+        <w:tc>
+          <w:tcPr>
+            <w:tcW w:type="dxa" w:w="3024"/>
+          </w:tcPr>
+          <w:p>
+            <w:r>
+              <w:t>Nº categorías</w:t>
+            </w:r>
+          </w:p>
+        </w:tc>
+        <w:tc>
+          <w:tcPr>
+            <w:tcW w:type="dxa" w:w="3024"/>
+          </w:tcPr>
+          <w:p>
+            <w:r>
+              <w:t>COUNT(DISTINCT categoría) por cliente</w:t>
+            </w:r>
+          </w:p>
+        </w:tc>
+        <w:tc>
+          <w:tcPr>
+            <w:tcW w:type="dxa" w:w="3024"/>
+          </w:tcPr>
+          <w:p>
+            <w:r>
+              <w:t>Líneas de pedido</w:t>
+            </w:r>
+          </w:p>
+        </w:tc>
+      </w:tr>
+      <w:tr>
+        <w:tc>
+          <w:tcPr>
+            <w:tcW w:type="dxa" w:w="3024"/>
+          </w:tcPr>
+          <w:p>
+            <w:r>
+              <w:t>Ticket medio</w:t>
+            </w:r>
+          </w:p>
+        </w:tc>
+        <w:tc>
+          <w:tcPr>
+            <w:tcW w:type="dxa" w:w="3024"/>
+          </w:tcPr>
+          <w:p>
+            <w:r>
+              <w:t>AVG(neto_pedido) por cliente</w:t>
+            </w:r>
+          </w:p>
+        </w:tc>
+        <w:tc>
+          <w:tcPr>
+            <w:tcW w:type="dxa" w:w="3024"/>
+          </w:tcPr>
+          <w:p>
+            <w:r>
+              <w:t>Pedidos</w:t>
+            </w:r>
+          </w:p>
+        </w:tc>
+      </w:tr>
+      <w:tr>
+        <w:tc>
+          <w:tcPr>
+            <w:tcW w:type="dxa" w:w="3024"/>
+          </w:tcPr>
+          <w:p>
+            <w:r>
+              <w:t>Tendencia</w:t>
+            </w:r>
+          </w:p>
+        </w:tc>
+        <w:tc>
+          <w:tcPr>
+            <w:tcW w:type="dxa" w:w="3024"/>
+          </w:tcPr>
+          <w:p>
+            <w:r>
+              <w:t>Ratio periodo actual / anterior</w:t>
+            </w:r>
+          </w:p>
+        </w:tc>
+        <w:tc>
+          <w:tcPr>
+            <w:tcW w:type="dxa" w:w="3024"/>
+          </w:tcPr>
+          <w:p>
+            <w:r>
+              <w:t>Comparar periodos</w:t>
+            </w:r>
+          </w:p>
+        </w:tc>
+      </w:tr>
+      <w:tr>
+        <w:tc>
+          <w:tcPr>
+            <w:tcW w:type="dxa" w:w="3024"/>
+          </w:tcPr>
+          <w:p>
+            <w:r>
+              <w:t>Margen</w:t>
+            </w:r>
+          </w:p>
+        </w:tc>
+        <w:tc>
+          <w:tcPr>
+            <w:tcW w:type="dxa" w:w="3024"/>
+          </w:tcPr>
+          <w:p>
+            <w:r>
+              <w:t>SUM(neto - coste) por cliente</w:t>
+            </w:r>
+          </w:p>
+        </w:tc>
+        <w:tc>
+          <w:tcPr>
+            <w:tcW w:type="dxa" w:w="3024"/>
+          </w:tcPr>
+          <w:p>
+            <w:r>
+              <w:t>Facturación + costes</w:t>
+            </w:r>
+          </w:p>
+        </w:tc>
+      </w:tr>
+    </w:tbl>
+    <w:p>
+      <w:pPr>
+        <w:pStyle w:val="ListParagraph"/>
+        <w:rPr>
+          <w:b/>
+          <w:bCs/>
+        </w:rPr>
+      </w:pPr>
+    </w:p>
+    <w:p>
+      <w:r>
+        <w:rPr>
+          <w:b/>
+        </w:rPr>
+        <w:t>Herramientas:</w:t>
+      </w:r>
+    </w:p>
+    <w:tbl>
+      <w:tblPr>
+        <w:tblW w:type="auto" w:w="0"/>
+        <w:jc w:val="center"/>
+        <w:tblLook w:firstColumn="1" w:firstRow="1" w:lastColumn="0" w:lastRow="0" w:noHBand="0" w:noVBand="1" w:val="04A0"/>
+      </w:tblPr>
+      <w:tblGrid>
+        <w:gridCol w:w="3024"/>
+        <w:gridCol w:w="3024"/>
+        <w:gridCol w:w="3024"/>
+      </w:tblGrid>
+      <w:tr>
+        <w:tc>
+          <w:tcPr>
+            <w:tcW w:type="dxa" w:w="3024"/>
+          </w:tcPr>
+          <w:p>
+            <w:r>
+              <w:rPr>
+                <w:b/>
+              </w:rPr>
+              <w:t>Capa</w:t>
+            </w:r>
+          </w:p>
+        </w:tc>
+        <w:tc>
+          <w:tcPr>
+            <w:tcW w:type="dxa" w:w="3024"/>
+          </w:tcPr>
+          <w:p>
+            <w:r>
+              <w:rPr>
+                <w:b/>
+              </w:rPr>
+              <w:t>Herramienta</w:t>
+            </w:r>
+          </w:p>
+        </w:tc>
+        <w:tc>
+          <w:tcPr>
+            <w:tcW w:type="dxa" w:w="3024"/>
+          </w:tcPr>
+          <w:p>
+            <w:r>
+              <w:rPr>
+                <w:b/>
+              </w:rPr>
+              <w:t>Uso</w:t>
+            </w:r>
+          </w:p>
+        </w:tc>
+      </w:tr>
+      <w:tr>
+        <w:tc>
+          <w:tcPr>
+            <w:tcW w:type="dxa" w:w="3024"/>
+          </w:tcPr>
+          <w:p>
+            <w:r>
+              <w:t>Fuente de datos</w:t>
+            </w:r>
+          </w:p>
+        </w:tc>
+        <w:tc>
+          <w:tcPr>
+            <w:tcW w:type="dxa" w:w="3024"/>
+          </w:tcPr>
+          <w:p>
+            <w:r>
+              <w:t>SAP / Oracle (esquema REPORTING)</w:t>
+            </w:r>
+          </w:p>
+        </w:tc>
+        <w:tc>
+          <w:tcPr>
+            <w:tcW w:type="dxa" w:w="3024"/>
+          </w:tcPr>
+          <w:p>
+            <w:r>
+              <w:t>Datos transaccionales reales</w:t>
+            </w:r>
+          </w:p>
+        </w:tc>
+      </w:tr>
+      <w:tr>
+        <w:tc>
+          <w:tcPr>
+            <w:tcW w:type="dxa" w:w="3024"/>
+          </w:tcPr>
+          <w:p>
+            <w:r>
+              <w:t>ETL y análisis</w:t>
+            </w:r>
+          </w:p>
+        </w:tc>
+        <w:tc>
+          <w:tcPr>
+            <w:tcW w:type="dxa" w:w="3024"/>
+          </w:tcPr>
+          <w:p>
+            <w:r>
+              <w:t>Python (pandas, scikit-learn, oracledb)</w:t>
+            </w:r>
+          </w:p>
+        </w:tc>
+        <w:tc>
+          <w:tcPr>
+            <w:tcW w:type="dxa" w:w="3024"/>
+          </w:tcPr>
+          <w:p>
+            <w:r>
+              <w:t>Extracción, limpieza, modelado</w:t>
+            </w:r>
+          </w:p>
+        </w:tc>
+      </w:tr>
+      <w:tr>
+        <w:tc>
+          <w:tcPr>
+            <w:tcW w:type="dxa" w:w="3024"/>
+          </w:tcPr>
+          <w:p>
+            <w:r>
+              <w:t>Queries</w:t>
+            </w:r>
+          </w:p>
+        </w:tc>
+        <w:tc>
+          <w:tcPr>
+            <w:tcW w:type="dxa" w:w="3024"/>
+          </w:tcPr>
+          <w:p>
+            <w:r>
+              <w:t>SQL</w:t>
+            </w:r>
+          </w:p>
+        </w:tc>
+        <w:tc>
+          <w:tcPr>
+            <w:tcW w:type="dxa" w:w="3024"/>
+          </w:tcPr>
+          <w:p>
+            <w:r>
+              <w:t>Consultas sobre Oracle</w:t>
+            </w:r>
+          </w:p>
+        </w:tc>
+      </w:tr>
+      <w:tr>
+        <w:tc>
+          <w:tcPr>
+            <w:tcW w:type="dxa" w:w="3024"/>
+          </w:tcPr>
+          <w:p>
+            <w:r>
+              <w:t>Visualización</w:t>
+            </w:r>
+          </w:p>
+        </w:tc>
+        <w:tc>
+          <w:tcPr>
+            <w:tcW w:type="dxa" w:w="3024"/>
+          </w:tcPr>
+          <w:p>
+            <w:r>
+              <w:t>Power BI</w:t>
+            </w:r>
+          </w:p>
+        </w:tc>
+        <w:tc>
+          <w:tcPr>
+            <w:tcW w:type="dxa" w:w="3024"/>
+          </w:tcPr>
+          <w:p>
+            <w:r>
+              <w:t>Dashboards interactivos</w:t>
+            </w:r>
+          </w:p>
+        </w:tc>
+      </w:tr>
+      <w:tr>
+        <w:tc>
+          <w:tcPr>
+            <w:tcW w:type="dxa" w:w="3024"/>
+          </w:tcPr>
+          <w:p>
+            <w:r>
+              <w:t>Documentación</w:t>
+            </w:r>
+          </w:p>
+        </w:tc>
+        <w:tc>
+          <w:tcPr>
+            <w:tcW w:type="dxa" w:w="3024"/>
+          </w:tcPr>
+          <w:p>
+            <w:r>
+              <w:t>Quarto / Word</w:t>
+            </w:r>
+          </w:p>
+        </w:tc>
+        <w:tc>
+          <w:tcPr>
+            <w:tcW w:type="dxa" w:w="3024"/>
+          </w:tcPr>
+          <w:p>
+            <w:r>
+              <w:t>Informes reproducibles</w:t>
+            </w:r>
+          </w:p>
+        </w:tc>
+      </w:tr>
+    </w:tbl>
+    <w:p>
+      <w:pPr>
+        <w:pStyle w:val="ListParagraph"/>
+        <w:rPr>
+          <w:b/>
+          <w:bCs/>
+        </w:rPr>
+      </w:pPr>
+    </w:p>
+    <w:p>
+      <w:pPr>
+        <w:pStyle w:val="Heading2"/>
+        <w:rPr>
+          <w:caps w:val="0"/>
+        </w:rPr>
+      </w:pPr>
+      <w:r>
+        <w:rPr>
+          <w:caps w:val="0"/>
         </w:rPr>
         <w:lastRenderedPageBreak/>
-        <w:drawing>
-          <wp:inline distT="0" distB="0" distL="0" distR="0" wp14:anchorId="578A5B07" wp14:editId="71D2F65A">
-            <wp:extent cx="2628478" cy="2752725"/>
-            <wp:effectExtent l="0" t="0" r="635" b="0"/>
-            <wp:docPr id="1" name="Imagen 1" descr="Resultado de imagen de marketing mix 4ps"/>
-            <wp:cNvGraphicFramePr>
-              <a:graphicFrameLocks xmlns:a="http://schemas.openxmlformats.org/drawingml/2006/main" noChangeAspect="1"/>
-            </wp:cNvGraphicFramePr>
-            <a:graphic xmlns:a="http://schemas.openxmlformats.org/drawingml/2006/main">
-              <a:graphicData uri="http://schemas.openxmlformats.org/drawingml/2006/picture">
-                <pic:pic xmlns:pic="http://schemas.openxmlformats.org/drawingml/2006/picture">
-                  <pic:nvPicPr>
-                    <pic:cNvPr id="0" name="Picture 1" descr="Resultado de imagen de marketing mix 4ps"/>
-                    <pic:cNvPicPr>
-                      <a:picLocks noChangeAspect="1" noChangeArrowheads="1"/>
-                    </pic:cNvPicPr>
-                  </pic:nvPicPr>
-                  <pic:blipFill rotWithShape="1">
-                    <a:blip r:embed="rId12" cstate="print">
-                      <a:extLst>
-                        <a:ext uri="{28A0092B-C50C-407E-A947-70E740481C1C}">
-                          <a14:useLocalDpi xmlns:a14="http://schemas.microsoft.com/office/drawing/2010/main" val="0"/>
-                        </a:ext>
-                      </a:extLst>
-                    </a:blip>
-                    <a:srcRect b="4776"/>
-                    <a:stretch/>
-                  </pic:blipFill>
-                  <pic:spPr bwMode="auto">
-                    <a:xfrm>
-                      <a:off x="0" y="0"/>
-                      <a:ext cx="2632641" cy="2757085"/>
-                    </a:xfrm>
-                    <a:prstGeom prst="rect">
-                      <a:avLst/>
-                    </a:prstGeom>
-                    <a:noFill/>
-                    <a:ln>
-                      <a:noFill/>
-                    </a:ln>
-                    <a:extLst>
-                      <a:ext uri="{53640926-AAD7-44D8-BBD7-CCE9431645EC}">
-                        <a14:shadowObscured xmlns:a14="http://schemas.microsoft.com/office/drawing/2010/main"/>
-                      </a:ext>
-                    </a:extLst>
-                  </pic:spPr>
-                </pic:pic>
-              </a:graphicData>
-            </a:graphic>
-          </wp:inline>
-        </w:drawing>
-      </w:r>
-    </w:p>
-    <w:p>
-      <w:pPr>
-        <w:pStyle w:val="Piedefoto-tabla"/>
-      </w:pPr>
-      <w:bookmarkStart w:id="10" w:name="_Toc437521786"/>
-      <w:bookmarkStart w:id="11" w:name="_Toc437522000"/>
-      <w:bookmarkStart w:id="12" w:name="_Toc437522282"/>
-      <w:bookmarkStart w:id="13" w:name="_Toc437522301"/>
-      <w:bookmarkStart w:id="14" w:name="_Toc20304756"/>
-      <w:r>
-        <w:t xml:space="preserve">Fuente: </w:t>
+        <w:t xml:space="preserve">Enfoque metodológico: </w:t>
+      </w:r>
+    </w:p>
+    <w:p>
+      <w:r>
+        <w:t>El proyecto sigue un ciclo ‘</w:t>
       </w:r>
       <w:proofErr w:type="spellStart"/>
       <w:r>
-        <w:t>elaboración</w:t>
+        <w:t>Intelligence-Action</w:t>
       </w:r>
       <w:proofErr w:type="spellEnd"/>
-      <w:r>
-        <w:t xml:space="preserve"> </w:t>
-      </w:r>
-      <w:proofErr w:type="spellStart"/>
-      <w:r>
-        <w:t>propia</w:t>
-      </w:r>
-      <w:bookmarkEnd w:id="10"/>
-      <w:bookmarkEnd w:id="11"/>
-      <w:bookmarkEnd w:id="12"/>
-      <w:bookmarkEnd w:id="13"/>
-      <w:bookmarkEnd w:id="14"/>
-      <w:proofErr w:type="spellEnd"/>
-      <w:r>
-        <w:t>.</w:t>
-      </w:r>
-    </w:p>
-    <w:p/>
-    <w:p>
-      <w:pPr>
-        <w:pStyle w:val="Heading4"/>
-      </w:pPr>
-      <w:bookmarkStart w:id="15" w:name="_Toc437515560"/>
-      <w:bookmarkStart w:id="16" w:name="_Toc14106982"/>
-      <w:r>
-        <w:t>“</w:t>
-      </w:r>
-      <w:r>
-        <w:t>Título 4</w:t>
-      </w:r>
-      <w:r>
-        <w:t>”</w:t>
-      </w:r>
-      <w:r>
-        <w:t xml:space="preserve"> del menú de estilos</w:t>
-      </w:r>
-      <w:bookmarkEnd w:id="15"/>
-      <w:bookmarkEnd w:id="16"/>
-    </w:p>
-    <w:p>
-      <w:r>
-        <w:t>Texto Normal del menú de estilos.</w:t>
-      </w:r>
-    </w:p>
-    <w:p/>
-    <w:p>
-      <w:pPr>
-        <w:pStyle w:val="Heading2"/>
-      </w:pPr>
-      <w:bookmarkStart w:id="17" w:name="_Toc32304473"/>
-      <w:r>
-        <w:rPr>
-          <w:caps w:val="0"/>
-        </w:rPr>
-        <w:t>Elementos innovadores del proyecto</w:t>
-      </w:r>
-      <w:bookmarkEnd w:id="17"/>
-    </w:p>
-    <w:p>
-      <w:r>
-        <w:t>Texto Normal del menú de estilos.</w:t>
-      </w:r>
-    </w:p>
-    <w:p>
-      <w:pPr>
-        <w:pStyle w:val="Heading3"/>
-      </w:pPr>
-      <w:bookmarkStart w:id="18" w:name="_Toc32304474"/>
-      <w:r>
-        <w:t>“Título 3” del menú de estilos</w:t>
-      </w:r>
-      <w:bookmarkEnd w:id="18"/>
-    </w:p>
-    <w:p>
-      <w:r>
-        <w:t>Texto Normal del menú de estilos.</w:t>
-      </w:r>
-    </w:p>
-    <w:p>
-      <w:pPr>
+      <w:proofErr w:type="gramStart"/>
+      <w:r>
+        <w:t>’ :</w:t>
+      </w:r>
+      <w:proofErr w:type="gramEnd"/>
+      <w:r>
+        <w:t xml:space="preserve"> extraer datos –&gt; analizar </w:t>
+      </w:r>
+      <w:r>
+        <w:t>–&gt;</w:t>
+      </w:r>
+      <w:r>
+        <w:t xml:space="preserve"> segmentar </w:t>
+      </w:r>
+      <w:r>
+        <w:t>–&gt;</w:t>
+      </w:r>
+      <w:r>
+        <w:t xml:space="preserve"> diseñar acción </w:t>
+      </w:r>
+      <w:r>
+        <w:t>–&gt;</w:t>
+      </w:r>
+      <w:r>
+        <w:t xml:space="preserve"> ejecutar </w:t>
+      </w:r>
+      <w:r>
+        <w:t>–&gt;</w:t>
+      </w:r>
+      <w:r>
+        <w:t xml:space="preserve"> medir</w:t>
+      </w:r>
+      <w:r>
+        <w:t>*</w:t>
+      </w:r>
+      <w:r>
+        <w:t xml:space="preserve"> (fuera del alcance del proyecto, si la empresa implementara). No se limita a describir segmentos (con un RFM clásico</w:t>
+      </w:r>
+      <w:r>
+        <w:rPr>
+          <w:highlight w:val="yellow"/>
+        </w:rPr>
+        <w:t>), si no que conecta cada segmento con una acción comercial cuya rentabilidad se calcula antes de ejecutar</w:t>
+      </w:r>
+    </w:p>
+    <w:p>
+      <w:pPr>
+        <w:pStyle w:val="NormalWeb"/>
+        <w:spacing w:before="0" w:beforeAutospacing="0" w:after="240" w:afterAutospacing="0"/>
+        <w:rPr>
+          <w:rFonts w:ascii="Segoe UI" w:hAnsi="Segoe UI" w:cs="Segoe UI"/>
+          <w:color w:val="C9D1D9"/>
+        </w:rPr>
+      </w:pPr>
+      <w:r>
+        <w:t xml:space="preserve">  </w:t>
+      </w:r>
+      <w:r>
+        <w:rPr>
+          <w:rFonts w:ascii="Segoe UI" w:hAnsi="Segoe UI" w:cs="Segoe UI"/>
+          <w:b/>
+          <w:bCs/>
+          <w:color w:val="C9D1D9"/>
+        </w:rPr>
+        <w:t>Pipeline:</w:t>
+      </w:r>
+    </w:p>
+    <w:p>
+      <w:pPr>
+        <w:tabs>
+          <w:tab w:val="left" w:pos="916"/>
+          <w:tab w:val="left" w:pos="1832"/>
+          <w:tab w:val="left" w:pos="2748"/>
+          <w:tab w:val="left" w:pos="3664"/>
+          <w:tab w:val="left" w:pos="4580"/>
+          <w:tab w:val="left" w:pos="5496"/>
+          <w:tab w:val="left" w:pos="6412"/>
+          <w:tab w:val="left" w:pos="7328"/>
+          <w:tab w:val="left" w:pos="8244"/>
+          <w:tab w:val="left" w:pos="9160"/>
+          <w:tab w:val="left" w:pos="10076"/>
+          <w:tab w:val="left" w:pos="10992"/>
+          <w:tab w:val="left" w:pos="11908"/>
+          <w:tab w:val="left" w:pos="12824"/>
+          <w:tab w:val="left" w:pos="13740"/>
+          <w:tab w:val="left" w:pos="14656"/>
+        </w:tabs>
         <w:spacing w:before="0" w:after="0" w:line="240" w:lineRule="auto"/>
         <w:jc w:val="left"/>
-      </w:pPr>
-      <w:r>
-        <w:br w:type="page"/>
-      </w:r>
-    </w:p>
-    <w:p>
-      <w:pPr>
-        <w:pStyle w:val="Heading1"/>
-      </w:pPr>
-      <w:bookmarkStart w:id="19" w:name="_Toc32304475"/>
-      <w:r>
-        <w:rPr>
-          <w:caps w:val="0"/>
-        </w:rPr>
-        <w:lastRenderedPageBreak/>
-        <w:t>Alcance y planificación</w:t>
-      </w:r>
-      <w:bookmarkEnd w:id="19"/>
-    </w:p>
-    <w:p>
-      <w:pPr>
-        <w:pStyle w:val="Heading2"/>
-      </w:pPr>
-      <w:bookmarkStart w:id="20" w:name="_Toc32304476"/>
-      <w:r>
-        <w:rPr>
-          <w:caps w:val="0"/>
-        </w:rPr>
-        <w:t>Fase de descubrimiento: evaluación del entorno actual</w:t>
-      </w:r>
-      <w:bookmarkEnd w:id="20"/>
-    </w:p>
-    <w:p>
-      <w:pPr>
-        <w:pStyle w:val="Heading3"/>
-      </w:pPr>
-      <w:bookmarkStart w:id="21" w:name="_Toc32304477"/>
-      <w:r>
-        <w:t>Información deseada</w:t>
-      </w:r>
-      <w:bookmarkEnd w:id="21"/>
-    </w:p>
-    <w:p>
-      <w:pPr>
-        <w:pStyle w:val="Heading4"/>
-      </w:pPr>
-      <w:r>
-        <w:t>"Título 4" del menú de estilos</w:t>
-      </w:r>
-    </w:p>
-    <w:p>
-      <w:pPr>
-        <w:pStyle w:val="Heading4"/>
-      </w:pPr>
-      <w:r>
-        <w:t>"Título 4" del menú de estilos</w:t>
-      </w:r>
-    </w:p>
-    <w:p>
-      <w:pPr>
-        <w:pStyle w:val="Heading3"/>
-      </w:pPr>
-      <w:bookmarkStart w:id="22" w:name="_Toc32304478"/>
-      <w:r>
-        <w:t>Información actual: deficiencias y soluciones alternativas.</w:t>
-      </w:r>
-      <w:bookmarkEnd w:id="22"/>
-    </w:p>
-    <w:p>
-      <w:pPr>
-        <w:pStyle w:val="Heading3"/>
-      </w:pPr>
-      <w:bookmarkStart w:id="23" w:name="_Toc32304479"/>
-      <w:r>
-        <w:t>Habilidades analíticas actuales.</w:t>
-      </w:r>
-      <w:bookmarkEnd w:id="23"/>
-    </w:p>
-    <w:p/>
-    <w:p>
-      <w:pPr>
-        <w:pStyle w:val="Heading2"/>
-      </w:pPr>
-      <w:r>
-        <w:rPr>
-          <w:caps w:val="0"/>
-        </w:rPr>
-        <w:t xml:space="preserve"> </w:t>
-      </w:r>
-      <w:bookmarkStart w:id="24" w:name="_Toc32304480"/>
-      <w:r>
-        <w:rPr>
-          <w:caps w:val="0"/>
-        </w:rPr>
-        <w:t xml:space="preserve">Fase de análisis: identificación de </w:t>
-      </w:r>
-      <w:r>
-        <w:rPr>
-          <w:i/>
-          <w:caps w:val="0"/>
-        </w:rPr>
-        <w:t>gaps</w:t>
-      </w:r>
-      <w:bookmarkEnd w:id="24"/>
-    </w:p>
-    <w:p>
-      <w:pPr>
-        <w:pStyle w:val="Heading3"/>
-      </w:pPr>
-      <w:bookmarkStart w:id="25" w:name="_Toc32304481"/>
-      <w:r>
-        <w:t>Capacidad de los informes actuales</w:t>
-      </w:r>
-      <w:bookmarkEnd w:id="25"/>
-    </w:p>
-    <w:p>
-      <w:pPr>
-        <w:pStyle w:val="Heading4"/>
-      </w:pPr>
-      <w:r>
-        <w:t>"Título 4" del menú de estilos</w:t>
-      </w:r>
-    </w:p>
-    <w:p>
-      <w:pPr>
-        <w:pStyle w:val="Heading4"/>
-      </w:pPr>
-      <w:r>
-        <w:t>"Título 4" del menú de estilos</w:t>
-      </w:r>
-    </w:p>
-    <w:p>
-      <w:pPr>
-        <w:pStyle w:val="Heading3"/>
-      </w:pPr>
-      <w:bookmarkStart w:id="26" w:name="_Toc32304482"/>
-      <w:r>
-        <w:t>Proveedores de tecnología necesarias</w:t>
-      </w:r>
-      <w:bookmarkEnd w:id="26"/>
-    </w:p>
-    <w:p>
-      <w:pPr>
-        <w:pStyle w:val="Heading3"/>
-      </w:pPr>
-      <w:bookmarkStart w:id="27" w:name="_Toc32304483"/>
-      <w:r>
-        <w:t>Diferencia entre los informes actuales y la información deseada</w:t>
-      </w:r>
-      <w:bookmarkEnd w:id="27"/>
-    </w:p>
-    <w:p>
-      <w:pPr>
-        <w:pStyle w:val="Heading3"/>
-      </w:pPr>
-      <w:bookmarkStart w:id="28" w:name="_Toc32304484"/>
-      <w:r>
-        <w:t>Cronología, costes y recursos humanos implicados</w:t>
-      </w:r>
-      <w:bookmarkEnd w:id="28"/>
-    </w:p>
-    <w:p>
-      <w:pPr>
-        <w:pStyle w:val="Heading4"/>
-        <w:numPr>
-          <w:ilvl w:val="0"/>
-          <w:numId w:val="0"/>
-        </w:numPr>
-        <w:ind w:left="851"/>
-      </w:pPr>
-    </w:p>
-    <w:p>
-      <w:pPr>
-        <w:pStyle w:val="Heading2"/>
-      </w:pPr>
-      <w:bookmarkStart w:id="29" w:name="_Toc32304485"/>
-      <w:r>
-        <w:rPr>
-          <w:caps w:val="0"/>
-        </w:rPr>
-        <w:t>Fa</w:t>
-      </w:r>
-      <w:r>
-        <w:rPr>
-          <w:caps w:val="0"/>
-        </w:rPr>
-        <w:t>s</w:t>
-      </w:r>
-      <w:r>
-        <w:rPr>
-          <w:caps w:val="0"/>
-        </w:rPr>
-        <w:t>e de recomendaciones: alcance, prioridades y presupuesto</w:t>
-      </w:r>
-      <w:bookmarkEnd w:id="29"/>
-    </w:p>
-    <w:p>
-      <w:pPr>
-        <w:pStyle w:val="Heading3"/>
-      </w:pPr>
-      <w:bookmarkStart w:id="30" w:name="_Toc32304486"/>
-      <w:r>
-        <w:t>Promoción del proyecto en la organización</w:t>
-      </w:r>
-      <w:bookmarkEnd w:id="30"/>
-    </w:p>
-    <w:p>
-      <w:pPr>
-        <w:pStyle w:val="Heading4"/>
-      </w:pPr>
-      <w:r>
-        <w:t>"Título 4" del menú de estilos</w:t>
-      </w:r>
-    </w:p>
-    <w:p>
-      <w:pPr>
-        <w:pStyle w:val="Heading4"/>
-      </w:pPr>
-      <w:r>
-        <w:t>"Título 4" del menú de estilos</w:t>
-      </w:r>
-    </w:p>
-    <w:p>
-      <w:pPr>
-        <w:pStyle w:val="Heading3"/>
-      </w:pPr>
-      <w:bookmarkStart w:id="31" w:name="_Toc32304487"/>
-      <w:r>
-        <w:t>Demostraciones</w:t>
-      </w:r>
-      <w:bookmarkEnd w:id="31"/>
-    </w:p>
-    <w:p/>
-    <w:p/>
-    <w:p>
-      <w:pPr>
+        <w:rPr>
+          <w:rFonts w:ascii="var(--code-font)" w:hAnsi="var(--code-font)" w:cs="Courier New"/>
+          <w:color w:val="C9D1D9"/>
+          <w:sz w:val="20"/>
+          <w:szCs w:val="20"/>
+          <w:bdr w:val="none" w:sz="0" w:space="0" w:color="auto" w:frame="1"/>
+          <w:lang w:val="en-US" w:eastAsia="en-US"/>
+        </w:rPr>
+      </w:pPr>
+      <w:r>
+        <w:rPr>
+          <w:rFonts w:ascii="var(--code-font)" w:hAnsi="var(--code-font)" w:cs="Courier New"/>
+          <w:color w:val="C9D1D9"/>
+          <w:sz w:val="20"/>
+          <w:szCs w:val="20"/>
+          <w:bdr w:val="none" w:sz="0" w:space="0" w:color="auto" w:frame="1"/>
+          <w:lang w:val="en-US" w:eastAsia="en-US"/>
+        </w:rPr>
+        <w:t>ETL (Python/SQL) → EDA (pandas/seaborn) → K-Means (scikit-learn)</w:t>
+      </w:r>
+    </w:p>
+    <w:p>
+      <w:pPr>
+        <w:tabs>
+          <w:tab w:val="left" w:pos="916"/>
+          <w:tab w:val="left" w:pos="1832"/>
+          <w:tab w:val="left" w:pos="2748"/>
+          <w:tab w:val="left" w:pos="3664"/>
+          <w:tab w:val="left" w:pos="4580"/>
+          <w:tab w:val="left" w:pos="5496"/>
+          <w:tab w:val="left" w:pos="6412"/>
+          <w:tab w:val="left" w:pos="7328"/>
+          <w:tab w:val="left" w:pos="8244"/>
+          <w:tab w:val="left" w:pos="9160"/>
+          <w:tab w:val="left" w:pos="10076"/>
+          <w:tab w:val="left" w:pos="10992"/>
+          <w:tab w:val="left" w:pos="11908"/>
+          <w:tab w:val="left" w:pos="12824"/>
+          <w:tab w:val="left" w:pos="13740"/>
+          <w:tab w:val="left" w:pos="14656"/>
+        </w:tabs>
         <w:spacing w:before="0" w:after="0" w:line="240" w:lineRule="auto"/>
         <w:jc w:val="left"/>
-      </w:pPr>
-      <w:r>
-        <w:br w:type="page"/>
-      </w:r>
+        <w:rPr>
+          <w:rFonts w:ascii="var(--code-font)" w:hAnsi="var(--code-font)" w:cs="Courier New"/>
+          <w:color w:val="C9D1D9"/>
+          <w:sz w:val="20"/>
+          <w:szCs w:val="20"/>
+          <w:lang w:eastAsia="en-US"/>
+        </w:rPr>
+      </w:pPr>
+      <w:r>
+        <w:rPr>
+          <w:rFonts w:ascii="var(--code-font)" w:hAnsi="var(--code-font)" w:cs="Courier New"/>
+          <w:color w:val="C9D1D9"/>
+          <w:sz w:val="20"/>
+          <w:szCs w:val="20"/>
+          <w:bdr w:val="none" w:sz="0" w:space="0" w:color="auto" w:frame="1"/>
+          <w:lang w:eastAsia="en-US"/>
+        </w:rPr>
+        <w:t xml:space="preserve">→ Perfilado (árboles) → BEP (matrices de escenarios) → </w:t>
+      </w:r>
+      <w:proofErr w:type="spellStart"/>
+      <w:r>
+        <w:rPr>
+          <w:rFonts w:ascii="var(--code-font)" w:hAnsi="var(--code-font)" w:cs="Courier New"/>
+          <w:color w:val="C9D1D9"/>
+          <w:sz w:val="20"/>
+          <w:szCs w:val="20"/>
+          <w:bdr w:val="none" w:sz="0" w:space="0" w:color="auto" w:frame="1"/>
+          <w:lang w:eastAsia="en-US"/>
+        </w:rPr>
+        <w:t>Dashboard</w:t>
+      </w:r>
+      <w:proofErr w:type="spellEnd"/>
+      <w:r>
+        <w:rPr>
+          <w:rFonts w:ascii="var(--code-font)" w:hAnsi="var(--code-font)" w:cs="Courier New"/>
+          <w:color w:val="C9D1D9"/>
+          <w:sz w:val="20"/>
+          <w:szCs w:val="20"/>
+          <w:bdr w:val="none" w:sz="0" w:space="0" w:color="auto" w:frame="1"/>
+          <w:lang w:eastAsia="en-US"/>
+        </w:rPr>
+        <w:t xml:space="preserve"> (</w:t>
+      </w:r>
+      <w:proofErr w:type="spellStart"/>
+      <w:r>
+        <w:rPr>
+          <w:rFonts w:ascii="var(--code-font)" w:hAnsi="var(--code-font)" w:cs="Courier New"/>
+          <w:color w:val="C9D1D9"/>
+          <w:sz w:val="20"/>
+          <w:szCs w:val="20"/>
+          <w:bdr w:val="none" w:sz="0" w:space="0" w:color="auto" w:frame="1"/>
+          <w:lang w:eastAsia="en-US"/>
+        </w:rPr>
+        <w:t>PowerBI</w:t>
+      </w:r>
+      <w:proofErr w:type="spellEnd"/>
+      <w:r>
+        <w:rPr>
+          <w:rFonts w:ascii="var(--code-font)" w:hAnsi="var(--code-font)" w:cs="Courier New"/>
+          <w:color w:val="C9D1D9"/>
+          <w:sz w:val="20"/>
+          <w:szCs w:val="20"/>
+          <w:bdr w:val="none" w:sz="0" w:space="0" w:color="auto" w:frame="1"/>
+          <w:lang w:eastAsia="en-US"/>
+        </w:rPr>
+        <w:t>)</w:t>
+      </w:r>
+    </w:p>
+    <w:p/>
+    <w:p>
+      <w:r>
+        <w:t xml:space="preserve">Aquí queremos </w:t>
+      </w:r>
+      <w:proofErr w:type="spellStart"/>
+      <w:r>
+        <w:t>aclarar</w:t>
+      </w:r>
+      <w:proofErr w:type="spellEnd"/>
+      <w:r>
+        <w:t xml:space="preserve"> que la metodología que usamos tiene diferencias sustanciales con las matrices RFM donde en base a la recencia se crean matrices de </w:t>
+      </w:r>
+      <w:proofErr w:type="spellStart"/>
+      <w:r>
+        <w:t>rentabilidad</w:t>
+      </w:r>
+      <w:proofErr w:type="spellEnd"/>
+      <w:r>
+        <w:t xml:space="preserve"> con volumen de compra. Para nosotros la recencia tiene menos peso, dado que nos encontramos en un entorno B2B y los ciclos de compra son regulares y predecibles, por lo que la Recencia pierde poder discriminante. Usamos variables </w:t>
+      </w:r>
+      <w:proofErr w:type="spellStart"/>
+      <w:r>
+        <w:t>multimensionales</w:t>
+      </w:r>
+      <w:proofErr w:type="spellEnd"/>
+      <w:r>
+        <w:t xml:space="preserve"> de comportamiento (Tamaño de la tienda, número de visitas del comercial, tipos de producto que compra, </w:t>
+      </w:r>
+      <w:proofErr w:type="spellStart"/>
+      <w:r>
+        <w:t>etc</w:t>
+      </w:r>
+      <w:proofErr w:type="spellEnd"/>
+      <w:r>
+        <w:t>). Aplicamos K-</w:t>
+      </w:r>
+      <w:proofErr w:type="spellStart"/>
+      <w:r>
+        <w:t>means</w:t>
+      </w:r>
+      <w:proofErr w:type="spellEnd"/>
+      <w:r>
+        <w:t xml:space="preserve"> sobre variables de comportamiento y no sobre </w:t>
+      </w:r>
+      <w:proofErr w:type="spellStart"/>
+      <w:r>
+        <w:t>scores</w:t>
+      </w:r>
+      <w:proofErr w:type="spellEnd"/>
+      <w:r>
+        <w:t xml:space="preserve"> RFM. </w:t>
+      </w:r>
+    </w:p>
+    <w:p>
+      <w:r>
+        <w:t xml:space="preserve">Perfilamos con árboles de decisión para generar reglas legibles para los directivos (“Si volumen &gt; 50K y frecuencia &gt; 24 -&gt; VIP). Aplicamos un BEP por </w:t>
+      </w:r>
+      <w:r>
+        <w:t>segmento</w:t>
+      </w:r>
+      <w:r>
+        <w:t xml:space="preserve"> porque cada </w:t>
+      </w:r>
+      <w:r>
+        <w:t>segmento</w:t>
+      </w:r>
+      <w:r>
+        <w:t xml:space="preserve"> tiene distinto comportamiento, margen, </w:t>
+      </w:r>
+      <w:proofErr w:type="gramStart"/>
+      <w:r>
+        <w:t>ticket</w:t>
+      </w:r>
+      <w:proofErr w:type="gramEnd"/>
+      <w:r>
+        <w:t xml:space="preserve"> y </w:t>
+      </w:r>
+      <w:r>
+        <w:t>frecuencia</w:t>
+      </w:r>
+      <w:r>
+        <w:t xml:space="preserve"> base. </w:t>
+      </w:r>
+    </w:p>
+    <w:p>
+      <w:pPr>
+        <w:pStyle w:val="ListParagraph"/>
+        <w:rPr>
+          <w:b/>
+          <w:bCs/>
+        </w:rPr>
+      </w:pPr>
     </w:p>
     <w:p>
       <w:pPr>
         <w:pStyle w:val="Heading1"/>
       </w:pPr>
-      <w:bookmarkStart w:id="32" w:name="_Toc32304488"/>
-      <w:r>
-        <w:lastRenderedPageBreak/>
-        <w:t>A</w:t>
+      <w:bookmarkStart w:id="9" w:name="_Toc32304525"/>
+      <w:r>
+        <w:t>L</w:t>
       </w:r>
       <w:r>
         <w:rPr>
           <w:caps w:val="0"/>
         </w:rPr>
-        <w:t>nálisis y definición</w:t>
-      </w:r>
-      <w:bookmarkEnd w:id="32"/>
-    </w:p>
-    <w:p>
-      <w:pPr>
-        <w:pStyle w:val="Heading2"/>
-      </w:pPr>
-      <w:bookmarkStart w:id="33" w:name="_Toc32304489"/>
-      <w:r>
-        <w:rPr>
-          <w:caps w:val="0"/>
-        </w:rPr>
-        <w:t>Análisis de los datos a utilizar</w:t>
-      </w:r>
-      <w:bookmarkEnd w:id="33"/>
-    </w:p>
-    <w:p>
-      <w:pPr>
-        <w:pStyle w:val="Heading3"/>
-      </w:pPr>
-      <w:bookmarkStart w:id="34" w:name="_Toc32304490"/>
-      <w:r>
-        <w:t>“Título 3” del menú de estilos</w:t>
-      </w:r>
-      <w:bookmarkEnd w:id="34"/>
-    </w:p>
-    <w:p>
-      <w:pPr>
-        <w:pStyle w:val="Heading3"/>
-      </w:pPr>
-      <w:bookmarkStart w:id="35" w:name="_Toc32304491"/>
-      <w:r>
-        <w:t>“Título 3” del menú de estilos</w:t>
-      </w:r>
-      <w:bookmarkEnd w:id="35"/>
-    </w:p>
-    <w:p>
-      <w:pPr>
-        <w:pStyle w:val="Heading4"/>
-      </w:pPr>
-      <w:r>
-        <w:t>"Título 4" del menú de estilos</w:t>
-      </w:r>
-    </w:p>
-    <w:p>
-      <w:pPr>
-        <w:pStyle w:val="Heading4"/>
-      </w:pPr>
-      <w:r>
-        <w:t>"Título 4" del menú de estilos</w:t>
+        <w:t>imitaciones y prospectiva</w:t>
+      </w:r>
+      <w:bookmarkEnd w:id="9"/>
+    </w:p>
+    <w:p>
+      <w:r>
+        <w:t xml:space="preserve">Para poder cerrar el ciclo </w:t>
+      </w:r>
+      <w:proofErr w:type="spellStart"/>
+      <w:r>
+        <w:t>intelligence-action</w:t>
+      </w:r>
+      <w:proofErr w:type="spellEnd"/>
+      <w:r>
+        <w:t xml:space="preserve"> (medir ROI real de una campaña), los pedidos deben registrar qué campa</w:t>
+      </w:r>
+      <w:r>
+        <w:t>ñ</w:t>
+      </w:r>
+      <w:r>
+        <w:t xml:space="preserve">a (mediante ID de campaña) se aplicó. Hoy SAP no lo hace; se aplica el </w:t>
+      </w:r>
+      <w:proofErr w:type="gramStart"/>
+      <w:r>
+        <w:t>descuento</w:t>
+      </w:r>
+      <w:proofErr w:type="gramEnd"/>
+      <w:r>
+        <w:t xml:space="preserve"> pero no queda trazabilidad de qué promoción aplicó originando ese descuento. En este proyecto proponemos un diseño de cómo hacer la trazabilidad de las promociones y de cómo los vendedores pueden aplicar o asignar la campaña de forma </w:t>
+      </w:r>
+      <w:proofErr w:type="spellStart"/>
+      <w:r>
+        <w:t>manualmente</w:t>
+      </w:r>
+      <w:proofErr w:type="spellEnd"/>
+      <w:r>
+        <w:t xml:space="preserve"> o automáticamente (cuando se dan las condiciones). De esta forma SAP permite registrar el ID de campaña en cada línea de pedido y podremos medir la respuesta y ROI real. </w:t>
       </w:r>
     </w:p>
     <w:p/>
-    <w:p>
-      <w:pPr>
-        <w:pStyle w:val="Heading2"/>
-      </w:pPr>
-      <w:bookmarkStart w:id="36" w:name="_Toc32304492"/>
-      <w:r>
-        <w:rPr>
-          <w:caps w:val="0"/>
-        </w:rPr>
-        <w:t>Análisis histórico y/o limpieza de datos</w:t>
-      </w:r>
-      <w:bookmarkEnd w:id="36"/>
-    </w:p>
-    <w:p>
-      <w:pPr>
-        <w:pStyle w:val="Heading3"/>
-      </w:pPr>
-      <w:bookmarkStart w:id="37" w:name="_Toc32304493"/>
-      <w:r>
-        <w:t>“Título 3” del menú de estilos</w:t>
-      </w:r>
-      <w:bookmarkEnd w:id="37"/>
-    </w:p>
-    <w:p>
-      <w:pPr>
-        <w:pStyle w:val="Heading3"/>
-      </w:pPr>
-      <w:bookmarkStart w:id="38" w:name="_Toc32304494"/>
-      <w:r>
-        <w:t>“Título 3” del menú de estilos</w:t>
-      </w:r>
-      <w:bookmarkEnd w:id="38"/>
-    </w:p>
-    <w:p>
-      <w:pPr>
-        <w:pStyle w:val="Heading4"/>
-      </w:pPr>
-      <w:r>
-        <w:t>"Título 4" del menú de estilos</w:t>
-      </w:r>
-    </w:p>
-    <w:p>
-      <w:pPr>
-        <w:pStyle w:val="Heading4"/>
-      </w:pPr>
-      <w:r>
-        <w:t>"Título 4" del menú de estilos</w:t>
-      </w:r>
-    </w:p>
-    <w:p/>
-    <w:p>
-      <w:pPr>
-        <w:pStyle w:val="Heading2"/>
-      </w:pPr>
-      <w:bookmarkStart w:id="39" w:name="_Toc32304495"/>
-      <w:r>
-        <w:rPr>
-          <w:caps w:val="0"/>
-        </w:rPr>
-        <w:t>Modelado propuesto</w:t>
-      </w:r>
-      <w:bookmarkEnd w:id="39"/>
-    </w:p>
-    <w:p>
-      <w:pPr>
-        <w:pStyle w:val="Heading3"/>
-      </w:pPr>
-      <w:bookmarkStart w:id="40" w:name="_Toc32304496"/>
-      <w:r>
-        <w:t>“Título 3” del menú de estilos</w:t>
-      </w:r>
-      <w:bookmarkEnd w:id="40"/>
-    </w:p>
-    <w:p>
-      <w:pPr>
-        <w:pStyle w:val="Heading3"/>
-      </w:pPr>
-      <w:bookmarkStart w:id="41" w:name="_Toc32304497"/>
-      <w:r>
-        <w:t>“Título 3” del menú de estilos</w:t>
-      </w:r>
-      <w:bookmarkEnd w:id="41"/>
-    </w:p>
-    <w:p>
-      <w:pPr>
-        <w:pStyle w:val="Heading4"/>
-      </w:pPr>
-      <w:r>
-        <w:t>"Título 4" del menú de estilos</w:t>
-      </w:r>
-    </w:p>
-    <w:p>
-      <w:pPr>
-        <w:pStyle w:val="Heading4"/>
-      </w:pPr>
-      <w:r>
-        <w:t>"Título 4" del menú de estilos</w:t>
-      </w:r>
-    </w:p>
     <w:p>
       <w:pPr>
         <w:spacing w:before="0" w:after="0" w:line="240" w:lineRule="auto"/>
         <w:jc w:val="left"/>
       </w:pPr>
-      <w:r>
-        <w:br w:type="page"/>
-      </w:r>
-    </w:p>
-    <w:p>
-      <w:pPr>
-        <w:pStyle w:val="Heading1"/>
-      </w:pPr>
-      <w:bookmarkStart w:id="42" w:name="_Toc32304498"/>
-      <w:r>
-        <w:lastRenderedPageBreak/>
-        <w:t>C</w:t>
-      </w:r>
-      <w:r>
-        <w:rPr>
-          <w:caps w:val="0"/>
-        </w:rPr>
-        <w:t>onstrucción, prueba, implementación y despliegue</w:t>
-      </w:r>
-      <w:bookmarkEnd w:id="42"/>
-    </w:p>
-    <w:p>
-      <w:pPr>
-        <w:pStyle w:val="Heading2"/>
-      </w:pPr>
-      <w:bookmarkStart w:id="43" w:name="_Toc32304499"/>
-      <w:r>
-        <w:rPr>
-          <w:caps w:val="0"/>
-        </w:rPr>
-        <w:t>Medidas de bondad del modelado</w:t>
-      </w:r>
-      <w:bookmarkEnd w:id="43"/>
-    </w:p>
-    <w:p>
-      <w:pPr>
-        <w:pStyle w:val="Heading3"/>
-      </w:pPr>
-      <w:bookmarkStart w:id="44" w:name="_Toc32304500"/>
-      <w:r>
-        <w:t>“Título 3” del menú de estilos</w:t>
-      </w:r>
-      <w:bookmarkEnd w:id="44"/>
-    </w:p>
-    <w:p>
-      <w:pPr>
-        <w:pStyle w:val="Heading3"/>
-      </w:pPr>
-      <w:bookmarkStart w:id="45" w:name="_Toc32304501"/>
-      <w:r>
-        <w:t>“Título 3” del menú de estilos</w:t>
-      </w:r>
-      <w:bookmarkEnd w:id="45"/>
-    </w:p>
-    <w:p>
-      <w:pPr>
-        <w:pStyle w:val="Heading4"/>
-      </w:pPr>
-      <w:r>
-        <w:t>"Título 4" del menú de estilos</w:t>
-      </w:r>
-    </w:p>
-    <w:p>
-      <w:pPr>
-        <w:pStyle w:val="Heading4"/>
-      </w:pPr>
-      <w:r>
-        <w:t>"Título 4" del menú de estilos</w:t>
-      </w:r>
-    </w:p>
-    <w:p/>
-    <w:p>
-      <w:pPr>
-        <w:pStyle w:val="Heading2"/>
-      </w:pPr>
-      <w:bookmarkStart w:id="46" w:name="_Toc32304502"/>
-      <w:r>
-        <w:rPr>
-          <w:caps w:val="0"/>
-        </w:rPr>
-        <w:t>Ejemplo de aplicación</w:t>
-      </w:r>
-      <w:bookmarkEnd w:id="46"/>
-    </w:p>
-    <w:p>
-      <w:pPr>
-        <w:pStyle w:val="Heading3"/>
-      </w:pPr>
-      <w:bookmarkStart w:id="47" w:name="_Toc32304503"/>
-      <w:r>
-        <w:t>“Título 3” del menú de estilos</w:t>
-      </w:r>
-      <w:bookmarkEnd w:id="47"/>
-    </w:p>
-    <w:p>
-      <w:pPr>
-        <w:pStyle w:val="Heading3"/>
-      </w:pPr>
-      <w:bookmarkStart w:id="48" w:name="_Toc32304504"/>
-      <w:r>
-        <w:t>“Título 3” del menú de estilos</w:t>
-      </w:r>
-      <w:bookmarkEnd w:id="48"/>
-    </w:p>
-    <w:p>
-      <w:pPr>
-        <w:pStyle w:val="Heading4"/>
-      </w:pPr>
-      <w:r>
-        <w:t>"Título 4" del menú de estilos</w:t>
-      </w:r>
-    </w:p>
-    <w:p>
-      <w:pPr>
-        <w:pStyle w:val="Heading4"/>
-      </w:pPr>
-      <w:r>
-        <w:t>"Título 4" del menú de estilos</w:t>
-      </w:r>
-    </w:p>
-    <w:p/>
+    </w:p>
     <w:p>
       <w:pPr>
         <w:spacing w:before="0" w:after="0" w:line="240" w:lineRule="auto"/>
         <w:jc w:val="left"/>
       </w:pPr>
-      <w:r>
-        <w:br w:type="page"/>
-      </w:r>
-    </w:p>
-    <w:p>
-      <w:pPr>
-        <w:pStyle w:val="Heading1"/>
-      </w:pPr>
-      <w:bookmarkStart w:id="49" w:name="_Toc32304505"/>
-      <w:r>
-        <w:lastRenderedPageBreak/>
-        <w:t>C</w:t>
-      </w:r>
-      <w:r>
-        <w:rPr>
-          <w:caps w:val="0"/>
-        </w:rPr>
-        <w:t>ronograma del proyecto</w:t>
-      </w:r>
-      <w:bookmarkEnd w:id="49"/>
-    </w:p>
-    <w:p>
-      <w:pPr>
-        <w:pStyle w:val="Heading2"/>
-      </w:pPr>
-      <w:bookmarkStart w:id="50" w:name="_Toc31964540"/>
-      <w:bookmarkStart w:id="51" w:name="_Toc32304506"/>
-      <w:proofErr w:type="spellStart"/>
-      <w:r>
-        <w:rPr>
-          <w:caps w:val="0"/>
-        </w:rPr>
-        <w:t>Swimlane</w:t>
-      </w:r>
-      <w:proofErr w:type="spellEnd"/>
-      <w:r>
-        <w:rPr>
-          <w:caps w:val="0"/>
-        </w:rPr>
-        <w:t xml:space="preserve"> de Inteligencia de negocio</w:t>
-      </w:r>
-      <w:bookmarkEnd w:id="50"/>
-      <w:bookmarkEnd w:id="51"/>
-    </w:p>
-    <w:p>
-      <w:pPr>
-        <w:pStyle w:val="Heading3"/>
-      </w:pPr>
-      <w:bookmarkStart w:id="52" w:name="_Toc32304507"/>
-      <w:r>
-        <w:t>“Título 3” del menú de estilos</w:t>
-      </w:r>
-      <w:bookmarkEnd w:id="52"/>
-    </w:p>
-    <w:p>
-      <w:pPr>
-        <w:pStyle w:val="Heading3"/>
-      </w:pPr>
-      <w:bookmarkStart w:id="53" w:name="_Toc32304508"/>
-      <w:r>
-        <w:t>“Título 3” del menú de estilos</w:t>
-      </w:r>
-      <w:bookmarkEnd w:id="53"/>
-    </w:p>
-    <w:p>
-      <w:pPr>
-        <w:pStyle w:val="Heading4"/>
-      </w:pPr>
-      <w:r>
-        <w:t>"Título 4" del menú de estilos</w:t>
-      </w:r>
-    </w:p>
-    <w:p>
-      <w:pPr>
-        <w:pStyle w:val="Heading4"/>
-      </w:pPr>
-      <w:r>
-        <w:t>"Título 4" del menú de estilos</w:t>
-      </w:r>
-    </w:p>
-    <w:p/>
-    <w:p>
-      <w:pPr>
-        <w:pStyle w:val="Heading2"/>
-      </w:pPr>
-      <w:bookmarkStart w:id="54" w:name="_Toc32304509"/>
-      <w:proofErr w:type="spellStart"/>
-      <w:r>
-        <w:rPr>
-          <w:caps w:val="0"/>
-        </w:rPr>
-        <w:t>Swimlane</w:t>
-      </w:r>
-      <w:proofErr w:type="spellEnd"/>
-      <w:r>
-        <w:rPr>
-          <w:caps w:val="0"/>
-        </w:rPr>
-        <w:t xml:space="preserve"> de datos y bases de datos</w:t>
-      </w:r>
-      <w:bookmarkEnd w:id="54"/>
-    </w:p>
-    <w:p>
-      <w:pPr>
-        <w:pStyle w:val="Heading3"/>
-      </w:pPr>
-      <w:bookmarkStart w:id="55" w:name="_Toc32304510"/>
-      <w:r>
-        <w:t>“Título 3” del menú de estilos</w:t>
-      </w:r>
-      <w:bookmarkEnd w:id="55"/>
-    </w:p>
-    <w:p>
-      <w:pPr>
-        <w:pStyle w:val="Heading3"/>
-      </w:pPr>
-      <w:bookmarkStart w:id="56" w:name="_Toc32304511"/>
-      <w:r>
-        <w:t>“Título 3” del menú de estilos</w:t>
-      </w:r>
-      <w:bookmarkEnd w:id="56"/>
-    </w:p>
-    <w:p>
-      <w:pPr>
-        <w:pStyle w:val="Heading4"/>
-      </w:pPr>
-      <w:r>
-        <w:t>"Título 4" del menú de estilos</w:t>
-      </w:r>
-    </w:p>
-    <w:p>
-      <w:pPr>
-        <w:pStyle w:val="Heading4"/>
-      </w:pPr>
-      <w:r>
-        <w:t>"Título 4" del menú de estilos</w:t>
-      </w:r>
-    </w:p>
-    <w:p/>
-    <w:p>
-      <w:pPr>
-        <w:pStyle w:val="Heading2"/>
-      </w:pPr>
-      <w:bookmarkStart w:id="57" w:name="_Toc32304512"/>
-      <w:proofErr w:type="spellStart"/>
-      <w:r>
-        <w:rPr>
-          <w:caps w:val="0"/>
-        </w:rPr>
-        <w:t>Swimlane</w:t>
-      </w:r>
-      <w:proofErr w:type="spellEnd"/>
-      <w:r>
-        <w:rPr>
-          <w:caps w:val="0"/>
-        </w:rPr>
-        <w:t xml:space="preserve"> de la integración de datos</w:t>
-      </w:r>
-      <w:bookmarkEnd w:id="57"/>
-    </w:p>
-    <w:p>
-      <w:pPr>
-        <w:pStyle w:val="Heading3"/>
-      </w:pPr>
-      <w:bookmarkStart w:id="58" w:name="_Toc32304513"/>
-      <w:r>
-        <w:t>“Título 3” del menú de estilos</w:t>
-      </w:r>
-      <w:bookmarkEnd w:id="58"/>
-    </w:p>
-    <w:p>
-      <w:pPr>
-        <w:pStyle w:val="Heading3"/>
-      </w:pPr>
-      <w:bookmarkStart w:id="59" w:name="_Toc32304514"/>
-      <w:r>
-        <w:t>“Título 3” del menú de estilos</w:t>
-      </w:r>
-      <w:bookmarkEnd w:id="59"/>
-    </w:p>
-    <w:p>
-      <w:pPr>
-        <w:pStyle w:val="Heading4"/>
-      </w:pPr>
-      <w:r>
-        <w:t>"Título 4" del menú de estilos</w:t>
-      </w:r>
-    </w:p>
-    <w:p>
-      <w:pPr>
-        <w:pStyle w:val="Heading4"/>
-      </w:pPr>
-      <w:r>
-        <w:t>"Título 4" del menú de estilos</w:t>
-      </w:r>
-    </w:p>
-    <w:p/>
-    <w:p>
-      <w:pPr>
-        <w:pStyle w:val="Heading2"/>
-      </w:pPr>
-      <w:bookmarkStart w:id="60" w:name="_Toc32304515"/>
-      <w:proofErr w:type="spellStart"/>
-      <w:r>
-        <w:rPr>
-          <w:caps w:val="0"/>
-        </w:rPr>
-        <w:t>Swimlane</w:t>
-      </w:r>
-      <w:proofErr w:type="spellEnd"/>
-      <w:r>
-        <w:rPr>
-          <w:caps w:val="0"/>
-        </w:rPr>
-        <w:t xml:space="preserve"> de la infraestructura</w:t>
-      </w:r>
-      <w:bookmarkEnd w:id="60"/>
-    </w:p>
-    <w:p>
-      <w:pPr>
-        <w:pStyle w:val="Heading3"/>
-      </w:pPr>
-      <w:bookmarkStart w:id="61" w:name="_Toc32304516"/>
-      <w:r>
-        <w:t>“Título 3” del menú de estilos</w:t>
-      </w:r>
-      <w:bookmarkEnd w:id="61"/>
-    </w:p>
-    <w:p>
-      <w:pPr>
-        <w:pStyle w:val="Heading3"/>
-      </w:pPr>
-      <w:bookmarkStart w:id="62" w:name="_Toc32304517"/>
-      <w:r>
-        <w:t>“Título 3” del menú de estilos</w:t>
-      </w:r>
-      <w:bookmarkEnd w:id="62"/>
-    </w:p>
-    <w:p>
-      <w:pPr>
-        <w:pStyle w:val="Heading4"/>
-      </w:pPr>
-      <w:r>
-        <w:t>"Título 4" del menú de estilos</w:t>
-      </w:r>
-    </w:p>
-    <w:p>
-      <w:pPr>
-        <w:pStyle w:val="Heading4"/>
-      </w:pPr>
-      <w:r>
-        <w:t>"Título 4" del menú de estilos</w:t>
-      </w:r>
-    </w:p>
-    <w:p/>
-    <w:p>
-      <w:pPr>
-        <w:pStyle w:val="Heading2"/>
-      </w:pPr>
-      <w:bookmarkStart w:id="63" w:name="_Toc32304518"/>
-      <w:proofErr w:type="spellStart"/>
-      <w:r>
-        <w:rPr>
-          <w:caps w:val="0"/>
-        </w:rPr>
-        <w:lastRenderedPageBreak/>
-        <w:t>Swimlane</w:t>
-      </w:r>
-      <w:proofErr w:type="spellEnd"/>
-      <w:r>
-        <w:rPr>
-          <w:caps w:val="0"/>
-        </w:rPr>
-        <w:t xml:space="preserve"> de la gestión del proyecto</w:t>
-      </w:r>
-      <w:bookmarkEnd w:id="63"/>
-    </w:p>
-    <w:p>
-      <w:pPr>
-        <w:pStyle w:val="Heading3"/>
-      </w:pPr>
-      <w:bookmarkStart w:id="64" w:name="_Toc32304519"/>
-      <w:r>
-        <w:t>“Título 3” del menú de estilos</w:t>
-      </w:r>
-      <w:bookmarkEnd w:id="64"/>
-    </w:p>
-    <w:p>
-      <w:pPr>
-        <w:pStyle w:val="Heading3"/>
-      </w:pPr>
-      <w:bookmarkStart w:id="65" w:name="_Toc32304520"/>
-      <w:r>
-        <w:t>“Título 3” del menú de estilos</w:t>
-      </w:r>
-      <w:bookmarkEnd w:id="65"/>
-    </w:p>
-    <w:p>
-      <w:pPr>
-        <w:pStyle w:val="Heading4"/>
-      </w:pPr>
-      <w:r>
-        <w:t>"Título 4" del menú de estilos</w:t>
-      </w:r>
-    </w:p>
-    <w:p>
-      <w:pPr>
-        <w:pStyle w:val="Heading4"/>
-      </w:pPr>
-      <w:r>
-        <w:t>"Título 4" del menú de estilos</w:t>
-      </w:r>
-    </w:p>
-    <w:p>
-      <w:pPr>
-        <w:spacing w:before="0" w:after="0" w:line="240" w:lineRule="auto"/>
-        <w:jc w:val="left"/>
-      </w:pPr>
-      <w:r>
-        <w:br w:type="page"/>
-      </w:r>
-    </w:p>
-    <w:p>
-      <w:pPr>
-        <w:pStyle w:val="Heading1"/>
-      </w:pPr>
-      <w:bookmarkStart w:id="66" w:name="_Toc32304521"/>
-      <w:r>
-        <w:lastRenderedPageBreak/>
-        <w:t>C</w:t>
-      </w:r>
-      <w:r>
-        <w:rPr>
-          <w:caps w:val="0"/>
-        </w:rPr>
-        <w:t>onclusiones</w:t>
-      </w:r>
-      <w:bookmarkEnd w:id="66"/>
-    </w:p>
-    <w:p>
-      <w:pPr>
-        <w:pStyle w:val="Heading2"/>
-      </w:pPr>
-      <w:bookmarkStart w:id="67" w:name="_Toc32304522"/>
-      <w:r>
-        <w:rPr>
-          <w:caps w:val="0"/>
-        </w:rPr>
-        <w:t>“Título 2” del menú de est</w:t>
-      </w:r>
-      <w:r>
-        <w:rPr>
-          <w:caps w:val="0"/>
-        </w:rPr>
-        <w:t>ilos</w:t>
-      </w:r>
-      <w:bookmarkEnd w:id="67"/>
-    </w:p>
-    <w:p>
-      <w:pPr>
-        <w:pStyle w:val="Heading3"/>
-      </w:pPr>
-      <w:bookmarkStart w:id="68" w:name="_Toc32304523"/>
-      <w:r>
-        <w:t>“Título 3” del menú de estilos</w:t>
-      </w:r>
-      <w:bookmarkEnd w:id="68"/>
-    </w:p>
-    <w:p>
-      <w:pPr>
-        <w:pStyle w:val="Heading3"/>
-      </w:pPr>
-      <w:bookmarkStart w:id="69" w:name="_Toc32304524"/>
-      <w:r>
-        <w:t>“Título 3” del menú de estilos</w:t>
-      </w:r>
-      <w:bookmarkEnd w:id="69"/>
-    </w:p>
-    <w:p>
-      <w:pPr>
-        <w:pStyle w:val="Heading4"/>
-      </w:pPr>
-      <w:r>
-        <w:t>"Título 4" del menú de estilos</w:t>
-      </w:r>
-    </w:p>
-    <w:p>
-      <w:pPr>
-        <w:pStyle w:val="Heading4"/>
-      </w:pPr>
-      <w:r>
-        <w:t>"Título 4" del menú de estilos</w:t>
-      </w:r>
-    </w:p>
-    <w:p>
-      <w:pPr>
-        <w:spacing w:before="0" w:after="0" w:line="240" w:lineRule="auto"/>
-        <w:jc w:val="left"/>
-      </w:pPr>
-      <w:r>
-        <w:br w:type="page"/>
-      </w:r>
-    </w:p>
-    <w:p>
-      <w:pPr>
-        <w:pStyle w:val="Heading1"/>
-      </w:pPr>
-      <w:bookmarkStart w:id="70" w:name="_Toc32304525"/>
-      <w:r>
-        <w:lastRenderedPageBreak/>
-        <w:t>L</w:t>
-      </w:r>
-      <w:r>
-        <w:rPr>
-          <w:caps w:val="0"/>
-        </w:rPr>
-        <w:t>imitaciones y prospectiva</w:t>
-      </w:r>
-      <w:bookmarkEnd w:id="70"/>
-    </w:p>
-    <w:p>
-      <w:pPr>
-        <w:pStyle w:val="Heading2"/>
-      </w:pPr>
-      <w:bookmarkStart w:id="71" w:name="_Toc32304526"/>
-      <w:r>
-        <w:rPr>
-          <w:caps w:val="0"/>
-        </w:rPr>
-        <w:t>“Título 2” del menú de est</w:t>
-      </w:r>
-      <w:r>
-        <w:rPr>
-          <w:caps w:val="0"/>
-        </w:rPr>
-        <w:t>ilos</w:t>
-      </w:r>
-      <w:bookmarkEnd w:id="71"/>
-    </w:p>
-    <w:p>
-      <w:pPr>
-        <w:pStyle w:val="Heading3"/>
-      </w:pPr>
-      <w:bookmarkStart w:id="72" w:name="_Toc32304527"/>
-      <w:r>
-        <w:t>“Título 3” del menú de estilos</w:t>
-      </w:r>
-      <w:bookmarkEnd w:id="72"/>
-    </w:p>
-    <w:p>
-      <w:pPr>
-        <w:pStyle w:val="Heading3"/>
-      </w:pPr>
-      <w:bookmarkStart w:id="73" w:name="_Toc32304528"/>
-      <w:r>
-        <w:t>“Título 3” del menú de estilos</w:t>
-      </w:r>
-      <w:bookmarkEnd w:id="73"/>
-    </w:p>
-    <w:p>
-      <w:pPr>
-        <w:pStyle w:val="Heading4"/>
-      </w:pPr>
-      <w:r>
-        <w:t>"Título 4" del menú de estilos</w:t>
-      </w:r>
-    </w:p>
-    <w:p>
-      <w:pPr>
-        <w:pStyle w:val="Heading4"/>
-      </w:pPr>
-      <w:r>
-        <w:t>"Título 4" del menú de estilos</w:t>
-      </w:r>
-    </w:p>
-    <w:p/>
-    <w:p/>
-    <w:p>
-      <w:pPr>
-        <w:spacing w:before="0" w:after="0" w:line="240" w:lineRule="auto"/>
-        <w:jc w:val="left"/>
-      </w:pPr>
-    </w:p>
-    <w:p>
-      <w:pPr>
-        <w:spacing w:before="0" w:after="0" w:line="240" w:lineRule="auto"/>
-        <w:jc w:val="left"/>
-      </w:pPr>
-      <w:r>
-        <w:br w:type="page"/>
-      </w:r>
-    </w:p>
-    <w:p>
-      <w:pPr>
-        <w:pStyle w:val="Ttulo1sinnumerar"/>
-      </w:pPr>
-      <w:bookmarkStart w:id="74" w:name="_Toc32304529"/>
-      <w:r>
-        <w:lastRenderedPageBreak/>
-        <w:t>Referencias bibliográficas</w:t>
-      </w:r>
-      <w:bookmarkEnd w:id="74"/>
-    </w:p>
-    <w:p/>
-    <w:p>
-      <w:pPr>
-        <w:pStyle w:val="Referenciasbibliogrficas"/>
-      </w:pPr>
-      <w:r>
-        <w:t xml:space="preserve">Swanson, E., Barnes, M., Fall, A. M., &amp; Roberts, G. (2017). Predictors of Reading Comprehension Among Struggling Readers Who Exhibit Differing Levels of Inattention and Hyperactivity. </w:t>
-      </w:r>
-      <w:r>
-        <w:rPr>
-          <w:i/>
-        </w:rPr>
-        <w:t>Reading &amp; Writing Quarterly, 34</w:t>
-      </w:r>
-      <w:r>
-        <w:t>(2), 132-146. doi:</w:t>
-      </w:r>
-      <w:r>
-        <w:rPr>
-          <w:u w:val="single"/>
-        </w:rPr>
-        <w:t>10.1080/10573569.2017.1359712</w:t>
-      </w:r>
-    </w:p>
-    <w:p>
-      <w:pPr>
-        <w:spacing w:before="0" w:after="0" w:line="240" w:lineRule="auto"/>
-        <w:jc w:val="left"/>
-      </w:pPr>
-      <w:r>
-        <w:br w:type="page"/>
-      </w:r>
-    </w:p>
-    <w:p>
-      <w:pPr>
-        <w:pStyle w:val="Anexo"/>
-      </w:pPr>
     </w:p>
     <w:sectPr>
-      <w:headerReference w:type="default" r:id="rId13"/>
-      <w:footerReference w:type="default" r:id="rId14"/>
+      <w:headerReference w:type="default" r:id="rId12"/>
+      <w:footerReference w:type="default" r:id="rId13"/>
       <w:pgSz w:w="11906" w:h="16838"/>
       <w:pgMar w:top="1418" w:right="1134" w:bottom="1418" w:left="1701" w:header="709" w:footer="709" w:gutter="0"/>
       <w:cols w:space="708"/>
@@ -9001,6 +8990,118 @@
     </w:lvl>
   </w:abstractNum>
   <w:abstractNum w:abstractNumId="10" w15:restartNumberingAfterBreak="0">
+    <w:nsid w:val="3DA64159"/>
+    <w:multiLevelType w:val="hybridMultilevel"/>
+    <w:tmpl w:val="067C42A8"/>
+    <w:lvl w:ilvl="0" w:tplc="956A6688">
+      <w:numFmt w:val="bullet"/>
+      <w:lvlText w:val="-"/>
+      <w:lvlJc w:val="left"/>
+      <w:pPr>
+        <w:ind w:left="720" w:hanging="360"/>
+      </w:pPr>
+      <w:rPr>
+        <w:rFonts w:ascii="Calibri" w:eastAsia="Times New Roman" w:hAnsi="Calibri" w:cs="Calibri" w:hint="default"/>
+      </w:rPr>
+    </w:lvl>
+    <w:lvl w:ilvl="1" w:tplc="04090003" w:tentative="1">
+      <w:start w:val="1"/>
+      <w:numFmt w:val="bullet"/>
+      <w:lvlText w:val="o"/>
+      <w:lvlJc w:val="left"/>
+      <w:pPr>
+        <w:ind w:left="1440" w:hanging="360"/>
+      </w:pPr>
+      <w:rPr>
+        <w:rFonts w:ascii="Courier New" w:hAnsi="Courier New" w:cs="Courier New" w:hint="default"/>
+      </w:rPr>
+    </w:lvl>
+    <w:lvl w:ilvl="2" w:tplc="04090005" w:tentative="1">
+      <w:start w:val="1"/>
+      <w:numFmt w:val="bullet"/>
+      <w:lvlText w:val=""/>
+      <w:lvlJc w:val="left"/>
+      <w:pPr>
+        <w:ind w:left="2160" w:hanging="360"/>
+      </w:pPr>
+      <w:rPr>
+        <w:rFonts w:ascii="Wingdings" w:hAnsi="Wingdings" w:hint="default"/>
+      </w:rPr>
+    </w:lvl>
+    <w:lvl w:ilvl="3" w:tplc="04090001" w:tentative="1">
+      <w:start w:val="1"/>
+      <w:numFmt w:val="bullet"/>
+      <w:lvlText w:val=""/>
+      <w:lvlJc w:val="left"/>
+      <w:pPr>
+        <w:ind w:left="2880" w:hanging="360"/>
+      </w:pPr>
+      <w:rPr>
+        <w:rFonts w:ascii="Symbol" w:hAnsi="Symbol" w:hint="default"/>
+      </w:rPr>
+    </w:lvl>
+    <w:lvl w:ilvl="4" w:tplc="04090003" w:tentative="1">
+      <w:start w:val="1"/>
+      <w:numFmt w:val="bullet"/>
+      <w:lvlText w:val="o"/>
+      <w:lvlJc w:val="left"/>
+      <w:pPr>
+        <w:ind w:left="3600" w:hanging="360"/>
+      </w:pPr>
+      <w:rPr>
+        <w:rFonts w:ascii="Courier New" w:hAnsi="Courier New" w:cs="Courier New" w:hint="default"/>
+      </w:rPr>
+    </w:lvl>
+    <w:lvl w:ilvl="5" w:tplc="04090005" w:tentative="1">
+      <w:start w:val="1"/>
+      <w:numFmt w:val="bullet"/>
+      <w:lvlText w:val=""/>
+      <w:lvlJc w:val="left"/>
+      <w:pPr>
+        <w:ind w:left="4320" w:hanging="360"/>
+      </w:pPr>
+      <w:rPr>
+        <w:rFonts w:ascii="Wingdings" w:hAnsi="Wingdings" w:hint="default"/>
+      </w:rPr>
+    </w:lvl>
+    <w:lvl w:ilvl="6" w:tplc="04090001" w:tentative="1">
+      <w:start w:val="1"/>
+      <w:numFmt w:val="bullet"/>
+      <w:lvlText w:val=""/>
+      <w:lvlJc w:val="left"/>
+      <w:pPr>
+        <w:ind w:left="5040" w:hanging="360"/>
+      </w:pPr>
+      <w:rPr>
+        <w:rFonts w:ascii="Symbol" w:hAnsi="Symbol" w:hint="default"/>
+      </w:rPr>
+    </w:lvl>
+    <w:lvl w:ilvl="7" w:tplc="04090003" w:tentative="1">
+      <w:start w:val="1"/>
+      <w:numFmt w:val="bullet"/>
+      <w:lvlText w:val="o"/>
+      <w:lvlJc w:val="left"/>
+      <w:pPr>
+        <w:ind w:left="5760" w:hanging="360"/>
+      </w:pPr>
+      <w:rPr>
+        <w:rFonts w:ascii="Courier New" w:hAnsi="Courier New" w:cs="Courier New" w:hint="default"/>
+      </w:rPr>
+    </w:lvl>
+    <w:lvl w:ilvl="8" w:tplc="04090005" w:tentative="1">
+      <w:start w:val="1"/>
+      <w:numFmt w:val="bullet"/>
+      <w:lvlText w:val=""/>
+      <w:lvlJc w:val="left"/>
+      <w:pPr>
+        <w:ind w:left="6480" w:hanging="360"/>
+      </w:pPr>
+      <w:rPr>
+        <w:rFonts w:ascii="Wingdings" w:hAnsi="Wingdings" w:hint="default"/>
+      </w:rPr>
+    </w:lvl>
+  </w:abstractNum>
+  <w:abstractNum w:abstractNumId="11" w15:restartNumberingAfterBreak="0">
     <w:nsid w:val="40B76E27"/>
     <w:multiLevelType w:val="hybridMultilevel"/>
     <w:tmpl w:val="348094A2"/>
@@ -9086,7 +9187,7 @@
       </w:pPr>
     </w:lvl>
   </w:abstractNum>
-  <w:abstractNum w:abstractNumId="11" w15:restartNumberingAfterBreak="0">
+  <w:abstractNum w:abstractNumId="12" w15:restartNumberingAfterBreak="0">
     <w:nsid w:val="484D7BF5"/>
     <w:multiLevelType w:val="multilevel"/>
     <w:tmpl w:val="0C0A001F"/>
@@ -9172,7 +9273,7 @@
       </w:pPr>
     </w:lvl>
   </w:abstractNum>
-  <w:abstractNum w:abstractNumId="12" w15:restartNumberingAfterBreak="0">
+  <w:abstractNum w:abstractNumId="13" w15:restartNumberingAfterBreak="0">
     <w:nsid w:val="4A346511"/>
     <w:multiLevelType w:val="multilevel"/>
     <w:tmpl w:val="0C0A001F"/>
@@ -9258,7 +9359,7 @@
       </w:pPr>
     </w:lvl>
   </w:abstractNum>
-  <w:abstractNum w:abstractNumId="13" w15:restartNumberingAfterBreak="0">
+  <w:abstractNum w:abstractNumId="14" w15:restartNumberingAfterBreak="0">
     <w:nsid w:val="545F17C6"/>
     <w:multiLevelType w:val="hybridMultilevel"/>
     <w:tmpl w:val="57CEED46"/>
@@ -9344,7 +9445,7 @@
       </w:pPr>
     </w:lvl>
   </w:abstractNum>
-  <w:abstractNum w:abstractNumId="14" w15:restartNumberingAfterBreak="0">
+  <w:abstractNum w:abstractNumId="15" w15:restartNumberingAfterBreak="0">
     <w:nsid w:val="54DF44F2"/>
     <w:multiLevelType w:val="hybridMultilevel"/>
     <w:tmpl w:val="33DE1C96"/>
@@ -9433,7 +9534,7 @@
       </w:pPr>
     </w:lvl>
   </w:abstractNum>
-  <w:abstractNum w:abstractNumId="15" w15:restartNumberingAfterBreak="0">
+  <w:abstractNum w:abstractNumId="16" w15:restartNumberingAfterBreak="0">
     <w:nsid w:val="64851D42"/>
     <w:multiLevelType w:val="hybridMultilevel"/>
     <w:tmpl w:val="6D2A54F6"/>
@@ -9520,7 +9621,7 @@
       </w:pPr>
     </w:lvl>
   </w:abstractNum>
-  <w:abstractNum w:abstractNumId="16" w15:restartNumberingAfterBreak="0">
+  <w:abstractNum w:abstractNumId="17" w15:restartNumberingAfterBreak="0">
     <w:nsid w:val="693732B1"/>
     <w:multiLevelType w:val="multilevel"/>
     <w:tmpl w:val="393C3686"/>
@@ -9606,7 +9707,7 @@
       </w:pPr>
     </w:lvl>
   </w:abstractNum>
-  <w:abstractNum w:abstractNumId="17" w15:restartNumberingAfterBreak="0">
+  <w:abstractNum w:abstractNumId="18" w15:restartNumberingAfterBreak="0">
     <w:nsid w:val="6E946A08"/>
     <w:multiLevelType w:val="multilevel"/>
     <w:tmpl w:val="90EE6564"/>
@@ -9696,7 +9797,7 @@
       </w:pPr>
     </w:lvl>
   </w:abstractNum>
-  <w:abstractNum w:abstractNumId="18" w15:restartNumberingAfterBreak="0">
+  <w:abstractNum w:abstractNumId="19" w15:restartNumberingAfterBreak="0">
     <w:nsid w:val="6EAB6542"/>
     <w:multiLevelType w:val="hybridMultilevel"/>
     <w:tmpl w:val="E33AE3B6"/>
@@ -9782,7 +9883,7 @@
       </w:pPr>
     </w:lvl>
   </w:abstractNum>
-  <w:abstractNum w:abstractNumId="19" w15:restartNumberingAfterBreak="0">
+  <w:abstractNum w:abstractNumId="20" w15:restartNumberingAfterBreak="0">
     <w:nsid w:val="748E2F9F"/>
     <w:multiLevelType w:val="multilevel"/>
     <w:tmpl w:val="0C0A001F"/>
@@ -9868,7 +9969,7 @@
       </w:pPr>
     </w:lvl>
   </w:abstractNum>
-  <w:abstractNum w:abstractNumId="20" w15:restartNumberingAfterBreak="0">
+  <w:abstractNum w:abstractNumId="21" w15:restartNumberingAfterBreak="0">
     <w:nsid w:val="7D4A58B6"/>
     <w:multiLevelType w:val="multilevel"/>
     <w:tmpl w:val="E0A4B08C"/>
@@ -9958,10 +10059,10 @@
     <w:abstractNumId w:val="7"/>
   </w:num>
   <w:num w:numId="2" w16cid:durableId="1591620311">
-    <w:abstractNumId w:val="18"/>
+    <w:abstractNumId w:val="19"/>
   </w:num>
   <w:num w:numId="3" w16cid:durableId="1368607211">
-    <w:abstractNumId w:val="10"/>
+    <w:abstractNumId w:val="11"/>
   </w:num>
   <w:num w:numId="4" w16cid:durableId="2047832056">
     <w:abstractNumId w:val="0"/>
@@ -9970,22 +10071,22 @@
     <w:abstractNumId w:val="4"/>
   </w:num>
   <w:num w:numId="6" w16cid:durableId="444420210">
-    <w:abstractNumId w:val="12"/>
+    <w:abstractNumId w:val="13"/>
   </w:num>
   <w:num w:numId="7" w16cid:durableId="450707616">
-    <w:abstractNumId w:val="11"/>
+    <w:abstractNumId w:val="12"/>
   </w:num>
   <w:num w:numId="8" w16cid:durableId="912466349">
     <w:abstractNumId w:val="8"/>
   </w:num>
   <w:num w:numId="9" w16cid:durableId="990672972">
+    <w:abstractNumId w:val="16"/>
+  </w:num>
+  <w:num w:numId="10" w16cid:durableId="442457296">
     <w:abstractNumId w:val="15"/>
   </w:num>
-  <w:num w:numId="10" w16cid:durableId="442457296">
+  <w:num w:numId="11" w16cid:durableId="2125415793">
     <w:abstractNumId w:val="14"/>
-  </w:num>
-  <w:num w:numId="11" w16cid:durableId="2125415793">
-    <w:abstractNumId w:val="13"/>
   </w:num>
   <w:num w:numId="12" w16cid:durableId="276303743">
     <w:abstractNumId w:val="6"/>
@@ -10012,16 +10113,16 @@
     <w:abstractNumId w:val="9"/>
   </w:num>
   <w:num w:numId="17" w16cid:durableId="661616241">
-    <w:abstractNumId w:val="19"/>
+    <w:abstractNumId w:val="20"/>
   </w:num>
   <w:num w:numId="18" w16cid:durableId="1175683011">
-    <w:abstractNumId w:val="17"/>
+    <w:abstractNumId w:val="18"/>
   </w:num>
   <w:num w:numId="19" w16cid:durableId="526261599">
-    <w:abstractNumId w:val="20"/>
+    <w:abstractNumId w:val="21"/>
   </w:num>
   <w:num w:numId="20" w16cid:durableId="1800030119">
-    <w:abstractNumId w:val="16"/>
+    <w:abstractNumId w:val="17"/>
   </w:num>
   <w:num w:numId="21" w16cid:durableId="345133460">
     <w:abstractNumId w:val="3"/>
@@ -10031,6 +10132,9 @@
   </w:num>
   <w:num w:numId="23" w16cid:durableId="2071339290">
     <w:abstractNumId w:val="2"/>
+  </w:num>
+  <w:num w:numId="24" w16cid:durableId="156264266">
+    <w:abstractNumId w:val="10"/>
   </w:num>
 </w:numbering>
 </file>
@@ -10134,7 +10238,7 @@
     <w:lsdException w:name="Block Text" w:semiHidden="1" w:unhideWhenUsed="1"/>
     <w:lsdException w:name="Hyperlink" w:semiHidden="1" w:unhideWhenUsed="1"/>
     <w:lsdException w:name="FollowedHyperlink" w:semiHidden="1" w:unhideWhenUsed="1"/>
-    <w:lsdException w:name="Strong" w:uiPriority="22"/>
+    <w:lsdException w:name="Strong" w:uiPriority="22" w:qFormat="1"/>
     <w:lsdException w:name="Emphasis" w:uiPriority="20"/>
     <w:lsdException w:name="Document Map" w:semiHidden="1" w:unhideWhenUsed="1"/>
     <w:lsdException w:name="Plain Text" w:semiHidden="1" w:unhideWhenUsed="1"/>
@@ -11445,6 +11549,95 @@
       <w:lang w:val="en-US"/>
     </w:rPr>
   </w:style>
+  <w:style w:type="paragraph" w:styleId="NormalWeb">
+    <w:name w:val="Normal (Web)"/>
+    <w:basedOn w:val="Normal"/>
+    <w:uiPriority w:val="99"/>
+    <w:semiHidden/>
+    <w:unhideWhenUsed/>
+    <w:rsid w:val="00882FE8"/>
+    <w:pPr>
+      <w:spacing w:before="100" w:beforeAutospacing="1" w:after="100" w:afterAutospacing="1" w:line="240" w:lineRule="auto"/>
+      <w:jc w:val="left"/>
+    </w:pPr>
+    <w:rPr>
+      <w:rFonts w:ascii="Times New Roman" w:hAnsi="Times New Roman"/>
+      <w:lang w:val="en-US" w:eastAsia="en-US"/>
+    </w:rPr>
+  </w:style>
+  <w:style w:type="character" w:styleId="Strong">
+    <w:name w:val="Strong"/>
+    <w:basedOn w:val="DefaultParagraphFont"/>
+    <w:uiPriority w:val="22"/>
+    <w:qFormat/>
+    <w:rsid w:val="00882FE8"/>
+    <w:rPr>
+      <w:b/>
+      <w:bCs/>
+    </w:rPr>
+  </w:style>
+  <w:style w:type="paragraph" w:styleId="HTMLPreformatted">
+    <w:name w:val="HTML Preformatted"/>
+    <w:basedOn w:val="Normal"/>
+    <w:link w:val="HTMLPreformattedChar"/>
+    <w:uiPriority w:val="99"/>
+    <w:semiHidden/>
+    <w:unhideWhenUsed/>
+    <w:rsid w:val="00882FE8"/>
+    <w:pPr>
+      <w:tabs>
+        <w:tab w:val="left" w:pos="916"/>
+        <w:tab w:val="left" w:pos="1832"/>
+        <w:tab w:val="left" w:pos="2748"/>
+        <w:tab w:val="left" w:pos="3664"/>
+        <w:tab w:val="left" w:pos="4580"/>
+        <w:tab w:val="left" w:pos="5496"/>
+        <w:tab w:val="left" w:pos="6412"/>
+        <w:tab w:val="left" w:pos="7328"/>
+        <w:tab w:val="left" w:pos="8244"/>
+        <w:tab w:val="left" w:pos="9160"/>
+        <w:tab w:val="left" w:pos="10076"/>
+        <w:tab w:val="left" w:pos="10992"/>
+        <w:tab w:val="left" w:pos="11908"/>
+        <w:tab w:val="left" w:pos="12824"/>
+        <w:tab w:val="left" w:pos="13740"/>
+        <w:tab w:val="left" w:pos="14656"/>
+      </w:tabs>
+      <w:spacing w:before="0" w:after="0" w:line="240" w:lineRule="auto"/>
+      <w:jc w:val="left"/>
+    </w:pPr>
+    <w:rPr>
+      <w:rFonts w:ascii="Courier New" w:hAnsi="Courier New" w:cs="Courier New"/>
+      <w:sz w:val="20"/>
+      <w:szCs w:val="20"/>
+      <w:lang w:val="en-US" w:eastAsia="en-US"/>
+    </w:rPr>
+  </w:style>
+  <w:style w:type="character" w:customStyle="1" w:styleId="HTMLPreformattedChar">
+    <w:name w:val="HTML Preformatted Char"/>
+    <w:basedOn w:val="DefaultParagraphFont"/>
+    <w:link w:val="HTMLPreformatted"/>
+    <w:uiPriority w:val="99"/>
+    <w:semiHidden/>
+    <w:rsid w:val="00882FE8"/>
+    <w:rPr>
+      <w:rFonts w:ascii="Courier New" w:eastAsia="Times New Roman" w:hAnsi="Courier New" w:cs="Courier New"/>
+      <w:lang w:val="en-US" w:eastAsia="en-US"/>
+    </w:rPr>
+  </w:style>
+  <w:style w:type="character" w:styleId="HTMLCode">
+    <w:name w:val="HTML Code"/>
+    <w:basedOn w:val="DefaultParagraphFont"/>
+    <w:uiPriority w:val="99"/>
+    <w:semiHidden/>
+    <w:unhideWhenUsed/>
+    <w:rsid w:val="00882FE8"/>
+    <w:rPr>
+      <w:rFonts w:ascii="Courier New" w:eastAsia="Times New Roman" w:hAnsi="Courier New" w:cs="Courier New"/>
+      <w:sz w:val="20"/>
+      <w:szCs w:val="20"/>
+    </w:rPr>
+  </w:style>
 </w:styles>
 </file>
 
@@ -11722,19 +11915,6 @@
 </file>
 
 <file path=customXml/item2.xml><?xml version="1.0" encoding="utf-8"?>
-<?mso-contentType ?>
-<FormTemplates xmlns="http://schemas.microsoft.com/sharepoint/v3/contenttype/forms">
-  <Display>DocumentLibraryForm</Display>
-  <Edit>DocumentLibraryForm</Edit>
-  <New>DocumentLibraryForm</New>
-</FormTemplates>
-</file>
-
-<file path=customXml/item3.xml><?xml version="1.0" encoding="utf-8"?>
-<b:Sources xmlns:b="http://schemas.openxmlformats.org/officeDocument/2006/bibliography" xmlns="http://schemas.openxmlformats.org/officeDocument/2006/bibliography" SelectedStyle="\APASixthEditionOfficeOnline.xsl" StyleName="APA" Version="6"/>
-</file>
-
-<file path=customXml/item4.xml><?xml version="1.0" encoding="utf-8"?>
 <ct:contentTypeSchema xmlns:ct="http://schemas.microsoft.com/office/2006/metadata/contentType" xmlns:ma="http://schemas.microsoft.com/office/2006/metadata/properties/metaAttributes" ct:_="" ma:_="" ma:contentTypeName="Documento" ma:contentTypeID="0x010100DF3D7C797EA12745A270EF30E38719B9" ma:contentTypeVersion="19" ma:contentTypeDescription="Crear nuevo documento." ma:contentTypeScope="" ma:versionID="9b3f85d10149739ebc40127471298f58">
   <xsd:schema xmlns:xsd="http://www.w3.org/2001/XMLSchema" xmlns:xs="http://www.w3.org/2001/XMLSchema" xmlns:p="http://schemas.microsoft.com/office/2006/metadata/properties" xmlns:ns2="0a70e875-3d35-4be2-921f-7117c31bab9b" xmlns:ns3="27c1adeb-3674-457c-b08c-8a73f31b6e23" targetNamespace="http://schemas.microsoft.com/office/2006/metadata/properties" ma:root="true" ma:fieldsID="0559bebde66b072b3ad70ef2676e7a86" ns2:_="" ns3:_="">
     <xsd:import namespace="0a70e875-3d35-4be2-921f-7117c31bab9b"/>
@@ -11995,6 +12175,19 @@
 </ct:contentTypeSchema>
 </file>
 
+<file path=customXml/item3.xml><?xml version="1.0" encoding="utf-8"?>
+<b:Sources xmlns:b="http://schemas.openxmlformats.org/officeDocument/2006/bibliography" xmlns="http://schemas.openxmlformats.org/officeDocument/2006/bibliography" SelectedStyle="\APASixthEditionOfficeOnline.xsl" StyleName="APA" Version="6"/>
+</file>
+
+<file path=customXml/item4.xml><?xml version="1.0" encoding="utf-8"?>
+<?mso-contentType ?>
+<FormTemplates xmlns="http://schemas.microsoft.com/sharepoint/v3/contenttype/forms">
+  <Display>DocumentLibraryForm</Display>
+  <Edit>DocumentLibraryForm</Edit>
+  <New>DocumentLibraryForm</New>
+</FormTemplates>
+</file>
+
 <file path=customXml/itemProps1.xml><?xml version="1.0" encoding="utf-8"?>
 <ds:datastoreItem xmlns:ds="http://schemas.openxmlformats.org/officeDocument/2006/customXml" ds:itemID="{59AD7AB7-C363-4C1D-ADF8-D3A5C9A5F0CA}">
   <ds:schemaRefs>
@@ -12007,22 +12200,6 @@
 </file>
 
 <file path=customXml/itemProps2.xml><?xml version="1.0" encoding="utf-8"?>
-<ds:datastoreItem xmlns:ds="http://schemas.openxmlformats.org/officeDocument/2006/customXml" ds:itemID="{1B5F85CB-6870-465C-AB66-5D6231D02CD3}">
-  <ds:schemaRefs>
-    <ds:schemaRef ds:uri="http://schemas.microsoft.com/sharepoint/v3/contenttype/forms"/>
-  </ds:schemaRefs>
-</ds:datastoreItem>
-</file>
-
-<file path=customXml/itemProps3.xml><?xml version="1.0" encoding="utf-8"?>
-<ds:datastoreItem xmlns:ds="http://schemas.openxmlformats.org/officeDocument/2006/customXml" ds:itemID="{65B201C0-AACA-43A1-8ABE-5508F7A41A05}">
-  <ds:schemaRefs>
-    <ds:schemaRef ds:uri="http://schemas.openxmlformats.org/officeDocument/2006/bibliography"/>
-  </ds:schemaRefs>
-</ds:datastoreItem>
-</file>
-
-<file path=customXml/itemProps4.xml><?xml version="1.0" encoding="utf-8"?>
 <ds:datastoreItem xmlns:ds="http://schemas.openxmlformats.org/officeDocument/2006/customXml" ds:itemID="{45D9445E-952E-468E-9C9E-226657E07712}">
   <ds:schemaRefs>
     <ds:schemaRef ds:uri="http://schemas.microsoft.com/office/2006/metadata/contentType"/>
@@ -12039,4 +12216,20 @@
     <ds:schemaRef ds:uri="http://schemas.microsoft.com/internal/obd"/>
   </ds:schemaRefs>
 </ds:datastoreItem>
+</file>
+
+<file path=customXml/itemProps3.xml><?xml version="1.0" encoding="utf-8"?>
+<ds:datastoreItem xmlns:ds="http://schemas.openxmlformats.org/officeDocument/2006/customXml" ds:itemID="{65B201C0-AACA-43A1-8ABE-5508F7A41A05}">
+  <ds:schemaRefs>
+    <ds:schemaRef ds:uri="http://schemas.openxmlformats.org/officeDocument/2006/bibliography"/>
+  </ds:schemaRefs>
+</ds:datastoreItem>
+</file>
+
+<file path=customXml/itemProps4.xml><?xml version="1.0" encoding="utf-8"?>
+<ds:datastoreItem xmlns:ds="http://schemas.openxmlformats.org/officeDocument/2006/customXml" ds:itemID="{1B5F85CB-6870-465C-AB66-5D6231D02CD3}">
+  <ds:schemaRefs>
+    <ds:schemaRef ds:uri="http://schemas.microsoft.com/sharepoint/v3/contenttype/forms"/>
+  </ds:schemaRefs>
+</ds:datastoreItem>
 </file>
</xml_diff>

<commit_message>
Merge E1: combinación de versiones Alejandro + Leticia en TFM_Garza_main
Sección 0 (Organización): Leticia (prosa académica)
Sección 1.1 (Justificación + problema): Leticia base + ejemplo RAMO de Alejandro
Sección 1.2 (Objetivos): Leticia (lenguaje académico formal)
Sección 1.3 (Elementos innovadores): Leticia (nueva, cubría el gap)
Sección 2 (Alcance): Alejandro (tablas, pipeline, enfoque metodológico)
Sección 7 (Limitaciones): Alejandro (atribución campañas)
Citas añadidas: Dolnicar et al. (2018), Luhn (1958)

Co-Authored-By: Claude Opus 4.6 (1M context) <noreply@anthropic.com>
</commit_message>
<xml_diff>
--- a/Cuatrimestre_2/TFM_Promociones_B2B/entregas/TFM_Garza_main.docx
+++ b/Cuatrimestre_2/TFM_Promociones_B2B/entregas/TFM_Garza_main.docx
@@ -559,10 +559,17 @@
     </w:p>
     <w:p>
       <w:r>
-        <w:t>Este aparado solo deberá ser incluido si se trata</w:t>
-      </w:r>
-      <w:r>
-        <w:t xml:space="preserve"> de un TFE de modalidad grupal y se incluirá antes de comenzar con el apartado de la introducción.</w:t>
+        <w:t xml:space="preserve">Este trabajo se desarrolla con un modelo colaborativo en el que ambos integrantes participan en todas las fases del proyecto. Se evita la división estricta de tareas y se favorece un proceso iterativo de revisión y mejora continua. No obstante, existen diferencias de rol que se derivan del perfil de cada uno así como del acceso a la información. Alejandro cuenta con acceso directo a los datos corporativos de la empresa a través del ERP SAP y la base de datos Oracle. Por este motivo, asume principalmente las tareas relacionadas con la extracción de datos, los procesos ETL y el modelo técnico. Leticia, por su parte, tiene mayor peso en la revisión bibliográfica, redacción de los apartados descriptivos y búsqueda de fuentes académicas en las que se apoya el trabajo.</w:t>
+      </w:r>
+    </w:p>
+    <w:p>
+      <w:r>
+        <w:t xml:space="preserve">A pesar de esta diferenciación, ambos participan de forma conjunta en el análisis de datos, la interpretación de los resultados y la redacción final de todas las secciones del proyecto. Las reuniones semanales permiten la coordinación del trabajo. En ellas, cada miembro presenta propuestas de integración sobre el trabajo previamente revisado por el otro, que posteriormente se validan de forma conjunta. Previo a cada reunión, ambos integrantes revisan los avances realizados por su compañero. Esto facilita un proceso continuo de contraste y de mejora.</w:t>
+      </w:r>
+    </w:p>
+    <w:p>
+      <w:r>
+        <w:t xml:space="preserve">Además, el proyecto se apoya en herramientas colaborativas para garantizar la trazabilidad y el control de versiones del trabajo. Se incluye repositorio privado en GitHub para el código y la documentación, también el uso de Google Colab para el desarrollo inicial de borradores de código colaborativos que, más tarde, serán los scripts en el entorno de desarrollo a través del IDE VSCode.</w:t>
       </w:r>
     </w:p>
     <w:p>
@@ -6348,25 +6355,6 @@
         <w:t xml:space="preserve"> </w:t>
       </w:r>
     </w:p>
-    <w:p>
-      <w:r>
-        <w:t>Texto Normal del menú de estilos.</w:t>
-      </w:r>
-    </w:p>
-    <w:p>
-      <w:r>
-        <w:t>Ejemplo de nota al pie</w:t>
-      </w:r>
-      <w:r>
-        <w:rPr>
-          <w:rStyle w:val="FootnoteReference"/>
-        </w:rPr>
-        <w:footnoteReference w:id="1"/>
-      </w:r>
-      <w:r>
-        <w:t>.</w:t>
-      </w:r>
-    </w:p>
     <w:p/>
     <w:p>
       <w:pPr>
@@ -6393,343 +6381,86 @@
     </w:p>
     <w:p>
       <w:r>
-        <w:t xml:space="preserve">En la distribución comercial a través de las superficies de bienes de consumo (Fast </w:t>
-      </w:r>
-      <w:proofErr w:type="spellStart"/>
-      <w:r>
-        <w:t>Moving</w:t>
-      </w:r>
-      <w:proofErr w:type="spellEnd"/>
-      <w:r>
-        <w:t xml:space="preserve"> </w:t>
-      </w:r>
-      <w:proofErr w:type="spellStart"/>
-      <w:r>
-        <w:t>Consumer</w:t>
-      </w:r>
-      <w:proofErr w:type="spellEnd"/>
-      <w:r>
-        <w:t xml:space="preserve"> Goods – FMCG) los canales de venta están cada vez más atomizados. Las superficies son físicas y digitales, especializadas en diferentes categorías de producto de un grupo de marcas (Por ejemplo: alimentación ecológica o boutiques de tecnología) para diferentes públicos objetivo (Gen Z, aventureros, familias con mascota, etc.). La amalgama de canales como supermercados, hipermercados, ferreterías, centros bricolajeros, bazares, tiendas de electrodomésticos y tecnología, y un largo etc.  sitúa a España como un país con una gran capilaridad comercial, lo que supone un reto competitivo para las marcas. </w:t>
-      </w:r>
-    </w:p>
-    <w:p>
-      <w:r>
-        <w:t>Por eso, la</w:t>
-      </w:r>
-      <w:r>
-        <w:t>s distribuidor</w:t>
-      </w:r>
-      <w:r>
-        <w:t>as</w:t>
-      </w:r>
-      <w:r>
-        <w:t xml:space="preserve"> juegan un papel decisivo para que </w:t>
-      </w:r>
-      <w:r>
-        <w:t>estas</w:t>
-      </w:r>
-      <w:r>
-        <w:t xml:space="preserve"> marcas estén presentes en los estantes </w:t>
-      </w:r>
-      <w:r>
-        <w:t>las</w:t>
-      </w:r>
-      <w:r>
-        <w:t xml:space="preserve"> tiendas físicas y digitales</w:t>
-      </w:r>
-      <w:r>
-        <w:t xml:space="preserve"> (Digital </w:t>
-      </w:r>
-      <w:proofErr w:type="spellStart"/>
-      <w:r>
-        <w:t>Shelf</w:t>
-      </w:r>
-      <w:proofErr w:type="spellEnd"/>
-      <w:r>
-        <w:t>)</w:t>
-      </w:r>
-      <w:r>
-        <w:t xml:space="preserve">. </w:t>
-      </w:r>
-      <w:r>
-        <w:t>E</w:t>
-      </w:r>
-      <w:r>
-        <w:t>n este contexto las promociones comerciales</w:t>
-      </w:r>
-      <w:r>
-        <w:t xml:space="preserve"> B2B (Business </w:t>
-      </w:r>
-      <w:proofErr w:type="spellStart"/>
-      <w:r>
-        <w:t>to</w:t>
-      </w:r>
-      <w:proofErr w:type="spellEnd"/>
-      <w:r>
-        <w:t xml:space="preserve"> Business)</w:t>
-      </w:r>
-      <w:r>
-        <w:t xml:space="preserve"> son una palanca crítica para diseñar estrategias promocionales efectivas que atiendan a las necesidades comerciales de los centros de consumo, pero se diseñan de forma genérica para todos los clientes de un mismo canal, sin evaluar su rentabilidad ni segmentar por comportamiento real. </w:t>
-      </w:r>
-    </w:p>
-    <w:p/>
+        <w:t xml:space="preserve">La estructura de distribución del mercado español de gran consumo se define por una alta fragmentación donde conviven diversos formatos, desde grandes superficies hasta tiendas especializadas en sectores como ferretería e iluminación. Así pues, la gestión de clientes y promociones debería responder a los distintos comportamientos de compra, tal y como se señalan en los análisis sectoriales del gran consumo en España, realizados por organizaciones como AECOC.</w:t>
+      </w:r>
+    </w:p>
+    <w:p>
+      <w:r>
+        <w:t xml:space="preserve">En este entorno heterogéneo y multicanal, los distribuidores exclusivos como Imprex Europe, son fundamentales y actúan como nexo crítico entre fabricantes y una extensa red de clientes profesionales con distintos comportamientos de compra. La competencia se extiende del lineal físico a la visibilidad digital del producto y a la capacidad de llevar a cabo promociones eficientes en los distintos canales. Es por esto que las promociones comerciales siguen siendo una palanca decisiva para impulsar ventas, ganar visibilidad y sostener la rotación. El diseño de estas campañas requiere, cada vez más, de mayor precisión analítica, pues esto ayuda a evitar decisiones uniformes cuando la respuesta del cliente no es homogénea. Esta necesidad conecta de forma directa con la segmentación del mercado, es decir, la herramienta estratégica para identificar grupos con características relevantes y diseñar acciones diferenciadas con mayor potencial de efectividad (Dolnicar, Grün y Leisch, 2018).</w:t>
+      </w:r>
+    </w:p>
+    <w:p>
+      <w:r>
+        <w:t xml:space="preserve">La justificación de este proyecto reside en la necesidad de evolucionar estas promociones comerciales, hacia una mayor precisión analítica. Actualmente, muchas organizaciones operan bajo un fenómeno conocido como HIPPO (Highest Paid Person's Opinion), donde las decisiones comerciales dependen más de la jerarquía o la intuición directiva que de la evidencia empírica (Luhn, 1958). Es decir, no se fundamenta en datos, ni en contraste ni en la experimentación. En escenarios de promociones, este sesgo puede llevar a descuentos homogéneos por canal o familia de cliente, sin un análisis previo del impacto diferencial sobre ventas, margen o rentabilidad.</w:t>
+      </w:r>
+    </w:p>
+    <w:p>
+      <w:r>
+        <w:t xml:space="preserve">Aunque existen modelos tradicionales de segmentación como el RFM (Recencia, Frecuencia y Valor Monetario), su aplicación aislada resulta insuficiente en entornos B2B, pues no captura la complejidad de las relaciones comerciales profesionales, ni la diversidad de categorías adquiridas. Por este motivo, este trabajo propone conectar el marco académico de la segmentación analítica con una aplicación real de inteligencia de negocio, para establecer bases objetivas que minimicen decisiones uniformes poco eficientes.</w:t>
+      </w:r>
+    </w:p>
+    <w:p>
+      <w:r>
+        <w:t xml:space="preserve">El planteamiento del problema se centra en que, en la actualidad, las promociones comerciales de la empresa se diseñan bajo criterios generales asociados al canal de venta, definidos en el sistema ERP mediante el estándar SAP conocido como 'RAMO'. Esto implica que los descuentos se aplican de forma uniforme a todos los clientes de un mismo canal —por ejemplo: 'Para el ramo X, por la compra de 500€ en Y referencias, aplica un descuento del 7%'—, dejando de lado las diferencias individuales en su comportamiento de compra, volumen de negocio o contribución al margen. Esta falta de personalización produce dos efectos negativos: por un lado, la dilución del margen en clientes que habrían realizado la compra sin el incentivo, y por otro, la pérdida de oportunidades comerciales en aquellos clientes que responderían positivamente a promociones diferenciadas.</w:t>
+      </w:r>
+    </w:p>
+    <w:p>
+      <w:r>
+        <w:t xml:space="preserve">El caso de estudio es la empresa Garza, especializada en soluciones de iluminación e IoT y distribuida en exclusiva en España por Imprex Europe. Garza cuenta con un portfolio multicategoría que comercializa a través de distintos canales B2B, como ferreterías, tiendas de bricolaje o distribuidores de material eléctrico, con clientes que presentan comportamientos de compra heterogéneos. Tomando como caso de estudio esta marca, surge la necesidad de validar si un enfoque analítico basado en datos puede mejorar el diseño de esas acciones comerciales. En consecuencia, el proyecto persigue dar respuesta a la siguiente pregunta de investigación: ¿Es posible optimizar las promociones comerciales B2B mediante segmentación analítica de clientes y simulación de escenarios de rentabilidad?</w:t>
+      </w:r>
+    </w:p>
     <w:p>
       <w:pPr>
         <w:pStyle w:val="Heading2"/>
-      </w:pPr>
-      <w:r>
         <w:rPr>
           <w:caps w:val="0"/>
         </w:rPr>
-        <w:t>Planteamiento del problema</w:t>
-      </w:r>
-    </w:p>
-    <w:p>
-      <w:pPr>
-        <w:pStyle w:val="Heading3"/>
-        <w:numPr>
-          <w:ilvl w:val="0"/>
-          <w:numId w:val="0"/>
-        </w:numPr>
-        <w:ind w:left="709" w:hanging="709"/>
-      </w:pPr>
-    </w:p>
-    <w:p>
-      <w:proofErr w:type="spellStart"/>
-      <w:r>
-        <w:t>Imprex</w:t>
-      </w:r>
-      <w:proofErr w:type="spellEnd"/>
-      <w:r>
-        <w:t xml:space="preserve"> Europe diseña promociones a los canales por el estándar SAP conocido como ‘RAMO’ (es decir, tipo de canal) utilizando descuentos uniformes con condiciones. Por ejemplo: ‘Para el </w:t>
-      </w:r>
-      <w:proofErr w:type="gramStart"/>
-      <w:r>
-        <w:t xml:space="preserve">ramo </w:t>
-      </w:r>
-      <w:r>
-        <w:t xml:space="preserve"> X</w:t>
-      </w:r>
-      <w:proofErr w:type="gramEnd"/>
-      <w:r>
-        <w:t xml:space="preserve"> Por la compra de 500€ en Y referencias, aplica un descuento del 7%’. No existe una segmentación por comportamiento de compra ni una evaluación previa de escenarios de </w:t>
-      </w:r>
-      <w:r>
-        <w:lastRenderedPageBreak/>
-        <w:t xml:space="preserve">rentabilidad (Break Even Point). Las decisiones son tipo HIPPO, o basados en la experiencia intuitiva. Esto genera una dilución de margen en clientes que habría comprado igual -con o sin descuento-, y oportunidades perdidas con clientes que necesitan incentivos distintos. </w:t>
-      </w:r>
-    </w:p>
-    <w:p>
-      <w:r>
-        <w:t xml:space="preserve">Nuestro caso de estudio concreto se </w:t>
-      </w:r>
-      <w:r>
-        <w:t>basa</w:t>
-      </w:r>
-      <w:r>
-        <w:t xml:space="preserve"> en una de las marcas que tiene </w:t>
-      </w:r>
-      <w:proofErr w:type="spellStart"/>
-      <w:r>
-        <w:t>Imprex</w:t>
-      </w:r>
-      <w:proofErr w:type="spellEnd"/>
-      <w:r>
-        <w:t xml:space="preserve"> en distribución. Garza, marca líder en iluminación y conectividad </w:t>
-      </w:r>
-      <w:proofErr w:type="spellStart"/>
-      <w:r>
-        <w:t>IoT</w:t>
-      </w:r>
-      <w:proofErr w:type="spellEnd"/>
-      <w:r>
-        <w:t xml:space="preserve"> </w:t>
-      </w:r>
-      <w:r>
-        <w:t xml:space="preserve">distribuida a través de múltiples canales B2B. </w:t>
-      </w:r>
-    </w:p>
-    <w:p>
-      <w:r>
-        <w:t xml:space="preserve">Nuestra pregunta de investigación es ¿Es posible optimizar las promociones comerciales B2B mediante segmentación analítica de clientes y simulación de escenarios de rentabilidad? </w:t>
-      </w:r>
-    </w:p>
-    <w:p/>
+      </w:pPr>
+      <w:r>
+        <w:rPr>
+          <w:caps w:val="0"/>
+        </w:rPr>
+        <w:t>Objetivos del TFE</w:t>
+      </w:r>
+    </w:p>
+    <w:p>
+      <w:r>
+        <w:t xml:space="preserve">El propósito fundamental de este TFE radica en el diseño y la evaluación de un sistema de segmentación de clientes B2B orientado a la optimización de promociones comerciales de la marca Garza. Mediante la aplicación de técnicas de clustering y análisis de rentabilidad sobre datos transaccionales de Imprex Europe, el proyecto persigue establecer una base analítica que sustituya los criterios generales actuales por estrategias personalizadas de alto impacto.</w:t>
+      </w:r>
+    </w:p>
+    <w:p>
+      <w:r>
+        <w:t xml:space="preserve">Para lograr este fin, se definen los objetivos específicos siguientes:</w:t>
+      </w:r>
+    </w:p>
+    <w:p>
+      <w:r>
+        <w:t xml:space="preserve">OE1: Ejecutar el proceso de extracción, transformación y carga (ETL) de datos procedentes del data lake corporativo. Se pretende consolidar una Tabla de Base Analítica (ABT), que garantice la integridad y calidad de la información para el estudio del comportamiento de compra.</w:t>
+      </w:r>
+    </w:p>
+    <w:p>
+      <w:r>
+        <w:t xml:space="preserve">OE2: Identificar patrones de comportamiento en la cartera de clientes B2B, mediante la implementación del algoritmo de aprendizaje no supervisado K-Means. Esto permite una segmentación técnica basada en variables transaccionales y de volumen de negocio.</w:t>
+      </w:r>
+    </w:p>
+    <w:p>
+      <w:r>
+        <w:t xml:space="preserve">OE3: Caracterizar y perfilar los segmentos resultantes a través del entrenamiento de modelos de árboles de decisión. El objetivo es extraer reglas de negocio comprensibles que faciliten la traducción de los hallazgos analíticos a acciones comerciales concretas.</w:t>
+      </w:r>
+    </w:p>
+    <w:p>
+      <w:r>
+        <w:t xml:space="preserve">OE4: Evaluar la viabilidad económica de las estrategias propuestas mediante la simulación de escenarios promocionales, utilizando el cálculo del punto de equilibrio (Break Even Point), para determinar la respuesta comercial mínima necesaria que garantice la rentabilidad operativa de cada segmento.</w:t>
+      </w:r>
+    </w:p>
+    <w:p>
+      <w:r>
+        <w:t xml:space="preserve">OE5: Desarrollar una herramienta de soporte a la toma de decisiones en forma de dashboard interactivo, integrando de manera visual la segmentación analítica y los escenarios de rentabilidad, optimizando así la agilidad en la definición de planes promocionales basados en datos.</w:t>
+      </w:r>
+    </w:p>
     <w:p>
       <w:pPr>
         <w:pStyle w:val="Heading2"/>
-        <w:rPr>
-          <w:caps w:val="0"/>
-        </w:rPr>
-      </w:pPr>
-      <w:r>
-        <w:rPr>
-          <w:caps w:val="0"/>
-        </w:rPr>
-        <w:t>Objetivos del TFE</w:t>
-      </w:r>
-    </w:p>
-    <w:p>
-      <w:r>
-        <w:t xml:space="preserve">Diseñamos un sistema de segmentación de clientes B2B y de optimización de promociones comerciales para la marca Garza, utilizando técnicas de </w:t>
-      </w:r>
-      <w:proofErr w:type="spellStart"/>
-      <w:r>
-        <w:t>clustering</w:t>
-      </w:r>
-      <w:proofErr w:type="spellEnd"/>
-      <w:r>
-        <w:t xml:space="preserve"> (K-</w:t>
-      </w:r>
-      <w:proofErr w:type="spellStart"/>
-      <w:r>
-        <w:t>means</w:t>
-      </w:r>
-      <w:proofErr w:type="spellEnd"/>
-      <w:r>
-        <w:t xml:space="preserve">) y análisis de rentabilidad, utilizando los datos reales del ERP (SAP) de su distribuidora </w:t>
-      </w:r>
-      <w:proofErr w:type="spellStart"/>
-      <w:r>
-        <w:t>Imprex</w:t>
-      </w:r>
-      <w:proofErr w:type="spellEnd"/>
-      <w:r>
-        <w:t xml:space="preserve"> Europe S.L. </w:t>
-      </w:r>
-    </w:p>
-    <w:p>
-      <w:r>
-        <w:t xml:space="preserve">Este sistema aspira no solamente a ser una propuesta académica, sino que también propondremos un sistema modular y reproducible que pueda ser implementado, mantenido y escalado. </w:t>
-      </w:r>
-    </w:p>
-    <w:p>
-      <w:r>
-        <w:t xml:space="preserve">Nuestros objetivos específicos son: </w:t>
-      </w:r>
-    </w:p>
-    <w:p>
-      <w:pPr>
-        <w:pStyle w:val="ListParagraph"/>
-        <w:numPr>
-          <w:ilvl w:val="0"/>
-          <w:numId w:val="24"/>
-        </w:numPr>
-      </w:pPr>
-      <w:r>
-        <w:t xml:space="preserve">Definir el alcance de datos necesarios (clientes, categorías de producto y canales de venta) y realizar el proceso ETL para obtener los datos </w:t>
-      </w:r>
-      <w:proofErr w:type="gramStart"/>
-      <w:r>
-        <w:t>del data</w:t>
-      </w:r>
-      <w:proofErr w:type="gramEnd"/>
-      <w:r>
-        <w:t xml:space="preserve"> </w:t>
-      </w:r>
-      <w:proofErr w:type="spellStart"/>
-      <w:r>
-        <w:t>lake</w:t>
-      </w:r>
-      <w:proofErr w:type="spellEnd"/>
-      <w:r>
-        <w:t xml:space="preserve"> corporativo en crudo, su exploración, limpieza e identificación de patrones</w:t>
-      </w:r>
-    </w:p>
-    <w:p>
-      <w:pPr>
-        <w:pStyle w:val="ListParagraph"/>
-        <w:numPr>
-          <w:ilvl w:val="0"/>
-          <w:numId w:val="24"/>
-        </w:numPr>
-      </w:pPr>
-      <w:r>
-        <w:t xml:space="preserve">Segmentar la base de clientes B2B mediante un </w:t>
-      </w:r>
-      <w:proofErr w:type="spellStart"/>
-      <w:r>
-        <w:t>clustering</w:t>
-      </w:r>
-      <w:proofErr w:type="spellEnd"/>
-      <w:r>
-        <w:t xml:space="preserve"> K-</w:t>
-      </w:r>
-      <w:proofErr w:type="spellStart"/>
-      <w:r>
-        <w:t>means</w:t>
-      </w:r>
-      <w:proofErr w:type="spellEnd"/>
-      <w:r>
-        <w:t xml:space="preserve"> sobre las variables de comportamiento relacionadas con la compra (volumen, frecuencia, categorías, </w:t>
-      </w:r>
-      <w:proofErr w:type="gramStart"/>
-      <w:r>
-        <w:t>ticket</w:t>
-      </w:r>
-      <w:proofErr w:type="gramEnd"/>
-      <w:r>
-        <w:t xml:space="preserve"> medio, tendencia, margen y otras dimensiones de cliente). </w:t>
-      </w:r>
-    </w:p>
-    <w:p>
-      <w:pPr>
-        <w:pStyle w:val="ListParagraph"/>
-        <w:numPr>
-          <w:ilvl w:val="0"/>
-          <w:numId w:val="24"/>
-        </w:numPr>
-      </w:pPr>
-      <w:r>
-        <w:t>Perfilar los segmentos resultantes mediante árboles de decisión para generar reglas que la dirección pueda interpretar, especialmente los equipos de marketing y comercial</w:t>
-      </w:r>
-    </w:p>
-    <w:p>
-      <w:pPr>
-        <w:pStyle w:val="ListParagraph"/>
-        <w:numPr>
-          <w:ilvl w:val="0"/>
-          <w:numId w:val="24"/>
-        </w:numPr>
-      </w:pPr>
-      <w:r>
-        <w:t>Simular escenarios promocionales por segmento mediante el cálculo del ‘Break Even Point’ (BEP) y matrices de respuesta (r * g)</w:t>
-      </w:r>
-    </w:p>
-    <w:p>
-      <w:pPr>
-        <w:pStyle w:val="ListParagraph"/>
-        <w:numPr>
-          <w:ilvl w:val="0"/>
-          <w:numId w:val="24"/>
-        </w:numPr>
-      </w:pPr>
-      <w:r>
-        <w:lastRenderedPageBreak/>
-        <w:t xml:space="preserve">Implementar un sistema de </w:t>
-      </w:r>
-      <w:proofErr w:type="gramStart"/>
-      <w:r>
-        <w:t xml:space="preserve">Business </w:t>
-      </w:r>
-      <w:proofErr w:type="spellStart"/>
-      <w:r>
-        <w:t>Intelligence</w:t>
-      </w:r>
-      <w:proofErr w:type="spellEnd"/>
-      <w:proofErr w:type="gramEnd"/>
-      <w:r>
-        <w:t xml:space="preserve"> visual que integre la segmentación y los escenarios para la toma de decisiones. </w:t>
-      </w:r>
-    </w:p>
-    <w:p>
-      <w:r>
-        <w:t>En definitiva, este sistema sirve para la toma de decisiones basados en el estudio descriptivo avanzado de los clientes para ofrecer una solución prescriptiva de las mejores estrategias comerciales en base a datos empíricos.</w:t>
-      </w:r>
-    </w:p>
-    <w:p>
-      <w:pPr>
-        <w:pStyle w:val="Heading2"/>
       </w:pPr>
       <w:r>
         <w:t>Elementos innovadores del proyecto</w:t>
@@ -6737,10 +6468,39 @@
     </w:p>
     <w:p>
       <w:r>
-        <w:t>[Pendiente de redactar — ver E1_borrador.md sección 1.3]</w:t>
-      </w:r>
-    </w:p>
-    <w:p/>
+        <w:t xml:space="preserve">La propuesta técnica de este trabajo introduce varios componentes diferenciales que trascienden el análisis descriptivo convencional para ofrecer una solución robusta y aplicable a un entorno empresarial real. Se aborda un problema empresarial concreto, utilizando datos reales procedentes de la organización.</w:t>
+      </w:r>
+    </w:p>
+    <w:p>
+      <w:r>
+        <w:t xml:space="preserve">En primer lugar, el trabajo propone una segmentación multivariable avanzada de clientes B2B. Mientras que los modelos clásicos de segmentación, como el enfoque RFM, se apoyan generalmente en tres dimensiones de comportamiento, este proyecto implementa un sistema de segmentación basado en seis variables de comportamiento de compra. Este enfoque permite capturar con mayor precisión la complejidad de los clientes profesionales. Incorpora métricas como el volumen anual de compra, la frecuencia del pedido, la diversidad de categorías adquiridas, el ticket medio, la tendencia de compra y el margen generado. Esto va a permitir obtener una visión más completa y operativa del valor y del comportamiento de cada cliente.</w:t>
+      </w:r>
+    </w:p>
+    <w:p>
+      <w:r>
+        <w:t xml:space="preserve">En segundo lugar, se introduce un análisis de rentabilidad específico con el cálculo del punto de equilibrio (Break Even Point) por segmento. Frente a la práctica habitual de aplicar descuentos uniformes a todos los clientes de un mismo canal, el modelo desarrollado permite calcular el umbral de rentabilidad para cada clúster de clientes. Teniendo en cuenta que cada segmento presenta estructuras distintas de margen, volumen de compra y frecuencia de pedido, el sistema permite simular el impacto económico de las promociones antes de su lanzamiento. Así se podrá evaluar si las condiciones propuestas permiten alcanzar niveles sostenibles de rentabilidad.</w:t>
+      </w:r>
+    </w:p>
+    <w:p>
+      <w:r>
+        <w:t xml:space="preserve">Otro elemento innovador del proyecto es la traducción de los modelos analíticos a reglas de negocio interpretables. Para ello, los modelos obtenidos mediante técnicas de clustering se perfilan utilizando árboles de decisión. Esto permite generar reglas claras y comprensibles para los equipos comerciales. Esta aproximación va a facilitar la transferencia del conocimiento generado por los modelos analíticos al ámbito operativo de la empresa, reduciendo la distancia entre el análisis de datos y la acción comercial.</w:t>
+      </w:r>
+    </w:p>
+    <w:p>
+      <w:r>
+        <w:t xml:space="preserve">Por otro lado, el modelo se desarrolla sobre datos transaccionales reales que proceden de un sistema ERP en producción, concretamente, de los sistemas SAP y Oracle utilizados por Imprex Europe. El uso de datos corporativos reales permite analizar el comportamiento efectivo de los clientes y evaluar la aplicabilidad práctica de las soluciones propuestas. Además, el sistema se diseña siguiendo un enfoque modular y reproducible mediante herramientas habituales en entornos de ciencia de datos, como Python, SQL y Power BI. Esto facilita su posible integración en un entorno profesional.</w:t>
+      </w:r>
+    </w:p>
+    <w:p>
+      <w:r>
+        <w:t xml:space="preserve">Por último, el trabajo incorpora una propuesta para cerrar el ciclo de medición y atribución de campañas comerciales. Se propone un sistema de identificación de campañas que permita registrar en cada línea de pedido la promoción aplicada. Esto posibilita trazar la relación directa entre una acción promocional y los pedidos generados. De esta manera, se podría medir con mayor precisión el retorno de la inversión (ROI) de las promociones comerciales, mejorando así la evaluación futura de las estrategias de marketing.</w:t>
+      </w:r>
+    </w:p>
+    <w:p>
+      <w:r>
+        <w:t xml:space="preserve">En conjunto, estos elementos innovadores van a permitir transformar un proceso tradicionalmente basado en la intuición comercial en un sistema analítico orientado a la toma de decisiones basada en datos, combinando técnicas de segmentación de clientes, modelización del comportamiento de compra y simulación económica de promociones.</w:t>
+      </w:r>
+    </w:p>
     <w:p>
       <w:pPr>
         <w:pStyle w:val="Heading1"/>

</xml_diff>

<commit_message>
E1: añadidas referencias bibliográficas APA al final del documento
- Caseiro y Coelho (2018) - BI and competitiveness
- Dolnicar, Grün y Leisch (2018) - Market Segmentation Analysis
- Kaplan y Norton (1992) - The Balanced Scorecard
- Luhn (1958) - A business intelligence system
Nota: actualizar TOC manualmente en Word (clic derecho > Actualizar campo)

Co-Authored-By: Claude Opus 4.6 (1M context) <noreply@anthropic.com>
</commit_message>
<xml_diff>
--- a/Cuatrimestre_2/TFM_Promociones_B2B/entregas/TFM_Garza_main.docx
+++ b/Cuatrimestre_2/TFM_Promociones_B2B/entregas/TFM_Garza_main.docx
@@ -7710,6 +7710,34 @@
       <w:proofErr w:type="gramEnd"/>
       <w:r>
         <w:t xml:space="preserve"> (cuando se dan las condiciones). De esta forma SAP permite registrar el ID de campaña en cada línea de pedido y podremos medir la respuesta y ROI real. </w:t>
+      </w:r>
+    </w:p>
+    <w:p>
+      <w:pPr>
+        <w:pStyle w:val="Heading1"/>
+      </w:pPr>
+      <w:r>
+        <w:t>Referencias bibliográficas</w:t>
+      </w:r>
+    </w:p>
+    <w:p>
+      <w:r>
+        <w:t xml:space="preserve">Caseiro, N. y Coelho, A. (2018). Business Intelligence and competitiveness: the mediating role of entrepreneurial orientation. Competitiveness Review: An International Business Journal, 28(2), 213-226.</w:t>
+      </w:r>
+    </w:p>
+    <w:p>
+      <w:r>
+        <w:t xml:space="preserve">Dolnicar, S., Grün, B. y Leisch, F. (2018). Market Segmentation Analysis: Understanding It, Doing It, and Making It Useful. Springer.</w:t>
+      </w:r>
+    </w:p>
+    <w:p>
+      <w:r>
+        <w:t xml:space="preserve">Kaplan, R. y Norton, D. (1992). The Balanced Scorecard – Measures that Drive Performance. Harvard Business Review, 70(1), 47-54.</w:t>
+      </w:r>
+    </w:p>
+    <w:p>
+      <w:r>
+        <w:t xml:space="preserve">Luhn, H. P. (1958). A business intelligence system. IBM Journal of Research and Development, 2(4), 314-319.</w:t>
       </w:r>
     </w:p>
     <w:p/>

</xml_diff>